<commit_message>
Scrub Marva Brainstorm register
</commit_message>
<xml_diff>
--- a/worlds/marva-lydell/submission/Marva_Lydell_Brainstorm.docx
+++ b/worlds/marva-lydell/submission/Marva_Lydell_Brainstorm.docx
@@ -175,93 +175,37 @@
               <w:rPr>
                 <w:sz w:val="18"/>
               </w:rPr>
-              <w:t>Build a cardiopulmonary transition world around Marva Lydell, a 72-year-old Black woman admitted with acute decompensated heart failure, cardiorenal acute kidney injury, COPD and obstructive sleep apnea overlap, atrial fibrillation on anticoagulation, diabetes, and limited home support. The world closes when she is medically improving but not yet transition-safe. Her resting oxygen saturation looks acceptable, the creatinine is improving, and the discharge plan reads clean at a glance. The real work is in the contradictions: exertional hypoxemia, incomplete oxygen equipment delivery, unresolved volume risk, renal-dose medication decisions, anticoagulation source hierarchy, and a home setting that cannot absorb a premature handoff.</w:t>
-            </w:r>
-          </w:p>
-          <w:p>
-            <w:r>
-              <w:rPr>
-                <w:sz w:val="18"/>
-              </w:rPr>
-            </w:r>
-          </w:p>
-          <w:p>
-            <w:r>
-              <w:rPr>
-                <w:sz w:val="18"/>
-              </w:rPr>
-              <w:t>The world should test whether a model can move from chart summarization to transition judgment. A strong answer must not merely list cardiology, nephrology, respiratory therapy, therapy, and case-management facts. It must decide what is safe to sign, what remains open, which owner must act, and which external document is wrong.</w:t>
-            </w:r>
-          </w:p>
-          <w:p>
-            <w:r>
-              <w:rPr>
-                <w:sz w:val="18"/>
-              </w:rPr>
-            </w:r>
-          </w:p>
-          <w:p>
-            <w:r>
-              <w:rPr>
-                <w:sz w:val="18"/>
-              </w:rPr>
-              <w:t>World type: Typical clinical world</w:t>
-            </w:r>
-          </w:p>
-          <w:p>
-            <w:r>
-              <w:rPr>
-                <w:sz w:val="18"/>
-              </w:rPr>
-              <w:t>Patient: Marva Lydell, 72-year-old Black woman in the United States</w:t>
-            </w:r>
-          </w:p>
-          <w:p>
-            <w:r>
-              <w:rPr>
-                <w:sz w:val="18"/>
-              </w:rPr>
-              <w:t>Core admission: Acute decompensated heart failure with hypoxemia, cardiorenal acute kidney injury, atrial fibrillation, COPD/OSA overlap, diabetes, and functional decline</w:t>
-            </w:r>
-          </w:p>
-          <w:p>
-            <w:r>
-              <w:rPr>
-                <w:sz w:val="18"/>
-              </w:rPr>
-              <w:t>Snapshot close: 06/10/2026 at 18:00, after improvement on inpatient diuresis but before safe post-acute execution is complete</w:t>
-            </w:r>
-          </w:p>
-          <w:p>
-            <w:r>
-              <w:rPr>
-                <w:sz w:val="18"/>
-              </w:rPr>
-              <w:t>Task window: 06/11/2026 through 06/17/2026. All tasks occur after the world snapshot and use task-level files for post-snapshot prompts, denials, drafts, reports, or follow-up notes</w:t>
-            </w:r>
-          </w:p>
-          <w:p>
-            <w:r>
-              <w:rPr>
-                <w:sz w:val="18"/>
-              </w:rPr>
-              <w:t>World file strategy: At least 30 world-level files. Hospital course, cardiology, nephrology, respiratory therapy, PT/OT, case management, pharmacy, labs, weights, oxygen testing, sleep equipment notes, medication lists, discharge planning notes, and family communication. No task answers in world files</w:t>
-            </w:r>
-          </w:p>
-          <w:p>
-            <w:r>
-              <w:rPr>
-                <w:sz w:val="18"/>
-              </w:rPr>
-              <w:t>Knowledge boundary: No task requires post-July 2025 medical knowledge. The clinical reasoning is standard transition-of-care reasoning, and every needed fact is in the mounted chart or task-level file</w:t>
-            </w:r>
-          </w:p>
-          <w:p>
-            <w:r>
-              <w:rPr>
-                <w:sz w:val="18"/>
-              </w:rPr>
-              <w:t>Product thesis: The patient is not a data visualization. The product is readiness. Each task asks whether the record supports a safe next move</w:t>
+              <w:t>Concept pitch for Team Lead review. World Type: Typical Clinical World (inpatient hospital medicine with post-discharge administrative and transition encounters). Snapshot: June 10, 2026 at 18:00. Patient: Marva Lydell, 72F. June 18, 2026.</w:t>
+            </w:r>
+          </w:p>
+          <w:p>
+            <w:r>
+              <w:rPr>
+                <w:sz w:val="18"/>
+              </w:rPr>
+            </w:r>
+          </w:p>
+          <w:p>
+            <w:r>
+              <w:rPr>
+                <w:sz w:val="18"/>
+              </w:rPr>
+              <w:t>This is an inpatient hospital medicine world: a 7-day admission for acute decompensated heart failure with hypoxemia and cardiorenal acute kidney injury in Marva Lydell, a 72-year-old Black woman with chronic heart failure, atrial fibrillation on anticoagulation, CKD stage 3b to 4, COPD and obstructive sleep apnea overlap, type 2 diabetes, hypertension, obesity, and limited mobility. She presents with dyspnea, edema, rising weight, exertional intolerance, and worsening kidney function after several days of worsening symptoms at home. The course runs ED evaluation, admission for IV diuresis and oxygen assessment, cardiology and nephrology consultation, respiratory therapy testing, therapy evaluation, medication adjustment, and discharge planning.</w:t>
+            </w:r>
+          </w:p>
+          <w:p>
+            <w:r>
+              <w:rPr>
+                <w:sz w:val="18"/>
+              </w:rPr>
+            </w:r>
+          </w:p>
+          <w:p>
+            <w:r>
+              <w:rPr>
+                <w:sz w:val="18"/>
+              </w:rPr>
+              <w:t>The world snapshot closes on June 10, 2026 at 18:00, at the point of realistic tension: she is clinically improved at rest, but transition safety remains unresolved. Creatinine is improving, resting oxygen saturation looks acceptable, and the discharge plan appears close. The unresolved issues are exertional oxygen need, portable oxygen delivery, diuretic and renal-medication follow-up, anticoagulation source hierarchy, functional tolerance, and the limits of home support. Every task is an independent encounter anchored after the snapshot. Each task can be answered from the planned chart, payer, respiratory therapy, pharmacy, case management, therapy, quality, and post-acute materials available to that requester.</w:t>
             </w:r>
           </w:p>
         </w:tc>
@@ -341,47 +285,47 @@
               <w:rPr>
                 <w:sz w:val="18"/>
               </w:rPr>
-              <w:t>Hospital medicine and cardiology versus payer medical director: The patient appears clinically improved, but the payer sees only stable resting vitals and misses exertional oxygen need, unresolved equipment, and post-acute skilled needs</w:t>
-            </w:r>
-          </w:p>
-          <w:p>
-            <w:r>
-              <w:rPr>
-                <w:sz w:val="18"/>
-              </w:rPr>
-              <w:t>Cardiology versus nephrology: Diuresis, kidney recovery, potassium, ACE inhibitor or SGLT2 restart, and anticoagulation all require ownership and timing. A model that treats improvement as resolution will close too much</w:t>
-            </w:r>
-          </w:p>
-          <w:p>
-            <w:r>
-              <w:rPr>
-                <w:sz w:val="18"/>
-              </w:rPr>
-              <w:t>Respiratory therapy and pulmonary versus case management and DME vendor: Resting oxygen and exertional oxygen tell different stories. DME status can look complete in one note while a vendor log shows portable equipment was not delivered</w:t>
-            </w:r>
-          </w:p>
-          <w:p>
-            <w:r>
-              <w:rPr>
-                <w:sz w:val="18"/>
-              </w:rPr>
-              <w:t>Patient and family preference versus functional safety: Marva wants home. A daughter can help intermittently. Therapy notes, stairs, fatigue, oxygen equipment, and medication complexity may still make the first plan unsafe</w:t>
-            </w:r>
-          </w:p>
-          <w:p>
-            <w:r>
-              <w:rPr>
-                <w:sz w:val="18"/>
-              </w:rPr>
-              <w:t>Pharmacy and SNF intake versus the inpatient chart: External medication or intake documents can carry forward the wrong anticoagulation dose, duplicate therapy, or stale renal dosing. The task should require source hierarchy, not transcription</w:t>
-            </w:r>
-          </w:p>
-          <w:p>
-            <w:r>
-              <w:rPr>
-                <w:sz w:val="18"/>
-              </w:rPr>
-              <w:t>Quality reviewer versus clinician author: A reviewer may ask for a clean documentation conclusion, while the right clinical answer is to leave control, equipment, or follow-up open with the correct owner</w:t>
+              <w:t>- Hospital medicine and cardiology versus the payer medical director (central): the payer reads stable resting vitals and improvement after diuresis as readiness for home with home health; the treating team reads the same admission as unsafe without reliable oxygen equipment, functional tolerance, and post-acute support.</w:t>
+            </w:r>
+          </w:p>
+          <w:p>
+            <w:r>
+              <w:rPr>
+                <w:sz w:val="18"/>
+              </w:rPr>
+              <w:t>- Cardiology versus nephrology: cardiology prioritizes decongestion, heart-failure protection, and readmission prevention; nephrology prioritizes kidney recovery, potassium safety, and careful timing for ACE inhibitor, SGLT2 inhibitor, metformin, and diuretic changes.</w:t>
+            </w:r>
+          </w:p>
+          <w:p>
+            <w:r>
+              <w:rPr>
+                <w:sz w:val="18"/>
+              </w:rPr>
+              <w:t>- Respiratory therapy and pulmonary versus case management and the DME vendor: respiratory testing identifies exertional oxygen need, while case management and vendor documentation may describe equipment as arranged before all usable pieces are actually delivered.</w:t>
+            </w:r>
+          </w:p>
+          <w:p>
+            <w:r>
+              <w:rPr>
+                <w:sz w:val="18"/>
+              </w:rPr>
+              <w:t>- Patient and family versus PT/OT and discharge planning: Marva wants to go home and her daughter can check in, but therapy findings, stairs, oxygen logistics, fatigue, and medication complexity may exceed that support.</w:t>
+            </w:r>
+          </w:p>
+          <w:p>
+            <w:r>
+              <w:rPr>
+                <w:sz w:val="18"/>
+              </w:rPr>
+              <w:t>- Pharmacy and SNF intake versus the inpatient chart: outside medication or intake documents can carry a stale anticoagulation dose, duplicate therapy, or renal-dose error that conflicts with the active inpatient record.</w:t>
+            </w:r>
+          </w:p>
+          <w:p>
+            <w:r>
+              <w:rPr>
+                <w:sz w:val="18"/>
+              </w:rPr>
+              <w:t>- Quality reviewer versus clinician author: administrative review often wants a clean closure, while the clinically correct answer may be to leave oxygen control, volume status, or follow-up ownership explicitly open.</w:t>
             </w:r>
           </w:p>
         </w:tc>
@@ -460,143 +404,71 @@
               <w:rPr>
                 <w:sz w:val="18"/>
               </w:rPr>
-              <w:t>Resting oxygen hides exertional hypoxemia: Model writes that oxygen is stable because resting saturation is acceptable</w:t>
-            </w:r>
-          </w:p>
-          <w:p>
-            <w:r>
-              <w:rPr>
-                <w:sz w:val="18"/>
-              </w:rPr>
-              <w:t>Fair catcher: Reads the walk-test or therapy signal and recognizes that exertional desaturation still needs oxygen planning</w:t>
-            </w:r>
-          </w:p>
-          <w:p>
-            <w:r>
-              <w:rPr>
-                <w:sz w:val="18"/>
-              </w:rPr>
-              <w:t>Equipment delivery over-closure: Model accepts "DME arranged" from discharge planning prose</w:t>
-            </w:r>
-          </w:p>
-          <w:p>
-            <w:r>
-              <w:rPr>
-                <w:sz w:val="18"/>
-              </w:rPr>
-              <w:t>Fair catcher: Checks the vendor or delivery note showing the portable oxygen piece is not delivered or not functional</w:t>
-            </w:r>
-          </w:p>
-          <w:p>
-            <w:r>
-              <w:rPr>
-                <w:sz w:val="18"/>
-              </w:rPr>
-              <w:t>Volume status over-closure: Model treats improving creatinine or lower BNP as readiness</w:t>
-            </w:r>
-          </w:p>
-          <w:p>
-            <w:r>
-              <w:rPr>
-                <w:sz w:val="18"/>
-              </w:rPr>
-              <w:t>Fair catcher: Reconciles weight, intake/output, edema, orthopnea, and renal trend before signing readiness</w:t>
-            </w:r>
-          </w:p>
-          <w:p>
-            <w:r>
-              <w:rPr>
-                <w:sz w:val="18"/>
-              </w:rPr>
-              <w:t>Renal-med restart drift: Model restarts ACE inhibitor, SGLT2 inhibitor, or metformin because discharge is near</w:t>
-            </w:r>
-          </w:p>
-          <w:p>
-            <w:r>
-              <w:rPr>
-                <w:sz w:val="18"/>
-              </w:rPr>
-              <w:t>Fair catcher: Keeps restart deferred until renal and volume parameters are met, with a clear owner</w:t>
-            </w:r>
-          </w:p>
-          <w:p>
-            <w:r>
-              <w:rPr>
-                <w:sz w:val="18"/>
-              </w:rPr>
-              <w:t>Anticoagulation source hierarchy: Model follows an external intake or SNF list with a wrong dose or duplicate antiplatelet</w:t>
-            </w:r>
-          </w:p>
-          <w:p>
-            <w:r>
-              <w:rPr>
-                <w:sz w:val="18"/>
-              </w:rPr>
-              <w:t>Fair catcher: Uses the chart, renal function, indication, bleeding history, and active orders to choose the safer reconciliation</w:t>
-            </w:r>
-          </w:p>
-          <w:p>
-            <w:r>
-              <w:rPr>
-                <w:sz w:val="18"/>
-              </w:rPr>
-              <w:t>Home support inflation: Model converts "daughter can check in" into a safe daily-care plan</w:t>
-            </w:r>
-          </w:p>
-          <w:p>
-            <w:r>
-              <w:rPr>
-                <w:sz w:val="18"/>
-              </w:rPr>
-              <w:t>Fair catcher: Preserves the actual support limits and connects them to oxygen, stairs, medication complexity, and follow-up reliability</w:t>
-            </w:r>
-          </w:p>
-          <w:p>
-            <w:r>
-              <w:rPr>
-                <w:sz w:val="18"/>
-              </w:rPr>
-              <w:t>Sleep and respiratory control over-closure: Model writes COPD or OSA is controlled because the chart says home devices exist</w:t>
-            </w:r>
-          </w:p>
-          <w:p>
-            <w:r>
-              <w:rPr>
-                <w:sz w:val="18"/>
-              </w:rPr>
-              <w:t>Fair catcher: Looks for actual device use, oxygen need, symptoms, or follow-up gaps before closing control</w:t>
-            </w:r>
-          </w:p>
-          <w:p>
-            <w:r>
-              <w:rPr>
-                <w:sz w:val="18"/>
-              </w:rPr>
-              <w:t>Denial-letter authority bias: Model softens the appeal because the payer denial is structured and official</w:t>
-            </w:r>
-          </w:p>
-          <w:p>
-            <w:r>
-              <w:rPr>
-                <w:sz w:val="18"/>
-              </w:rPr>
-              <w:t>Fair catcher: Refutes the denial using the chart facts that make skilled or equipment-level care necessary</w:t>
-            </w:r>
-          </w:p>
-          <w:p>
-            <w:r>
-              <w:rPr>
-                <w:sz w:val="18"/>
-              </w:rPr>
-              <w:t>Readmission attribution shortcut: Model blames nonadherence after a bounceback</w:t>
-            </w:r>
-          </w:p>
-          <w:p>
-            <w:r>
-              <w:rPr>
-                <w:sz w:val="18"/>
-              </w:rPr>
-              <w:t>Fair catcher: Finds the system failure, such as incomplete equipment delivery, unsafe medication handoff, or missing monitoring plan</w:t>
+              <w:t>- Resting oxygen versus exertional oxygen. Contradictory and buried information: resting saturation looks safe in routine vitals, while therapy or respiratory testing documents exertional desaturation. Requires synthesis across vitals, respiratory therapy testing, PT/OT tolerance, and discharge planning. World-level substrate; denial and continued-stay tasks can force the distinction.</w:t>
+            </w:r>
+          </w:p>
+          <w:p>
+            <w:r>
+              <w:rPr>
+                <w:sz w:val="18"/>
+              </w:rPr>
+              <w:t>- DME arranged versus DME delivered. Source-of-truth ambiguity: a case-management note may say oxygen was arranged, while vendor documentation shows that portable oxygen was not delivered, not functional, or not teach-backed. Requires synthesis across case management, vendor, nursing, and family communication. World-level substrate with post-snapshot administrative surfaces.</w:t>
+            </w:r>
+          </w:p>
+          <w:p>
+            <w:r>
+              <w:rPr>
+                <w:sz w:val="18"/>
+              </w:rPr>
+              <w:t>- Improving kidney function versus medication readiness. Temporal complexity: creatinine and potassium improve after diuresis, but that does not automatically make held renal or diabetes medications safe to restart. Requires synthesis across nephrology, cardiology, medication administration record, renal trend, and discharge medication list. World-level substrate; medication reconciliation and follow-up tasks force the decision.</w:t>
+            </w:r>
+          </w:p>
+          <w:p>
+            <w:r>
+              <w:rPr>
+                <w:sz w:val="18"/>
+              </w:rPr>
+              <w:t>- Volume status improvement versus transition readiness. Buried significant information: lower weight, improved edema, and better dyspnea coexist with orthopnea, exertional intolerance, and borderline renal recovery. Requires synthesis across progress notes, weights, intake/output, nursing notes, and therapy findings. World-level substrate.</w:t>
+            </w:r>
+          </w:p>
+          <w:p>
+            <w:r>
+              <w:rPr>
+                <w:sz w:val="18"/>
+              </w:rPr>
+              <w:t>- Anticoagulation dose and duplicate-therapy risk. Source-of-truth ambiguity: inpatient orders, home medication history, renal function, and post-acute intake documents may conflict on anticoagulation dose or antiplatelet overlap. Requires synthesis across MAR, discharge med list, renal trend, fill history, and SNF intake. World-level substrate; medication tasks and post-acute handoff tasks can force the stance.</w:t>
+            </w:r>
+          </w:p>
+          <w:p>
+            <w:r>
+              <w:rPr>
+                <w:sz w:val="18"/>
+              </w:rPr>
+              <w:t>- Home support overestimated. SDOH and functional context: daughter support is real but intermittent, and the home setting may include stairs, limited transportation, oxygen equipment burden, and complex medication changes. Requires synthesis across PT/OT, case management, nursing education, and family communication. World-level substrate.</w:t>
+            </w:r>
+          </w:p>
+          <w:p>
+            <w:r>
+              <w:rPr>
+                <w:sz w:val="18"/>
+              </w:rPr>
+              <w:t>- Respiratory control over-closed. Source-of-truth ambiguity: COPD or OSA may be described as stable because the patient owns home equipment, while the record does not prove effective use, exertional control, or adequate follow-up. Requires synthesis across respiratory therapy, sleep-equipment history, oxygen testing, and follow-up planning. World-level substrate.</w:t>
+            </w:r>
+          </w:p>
+          <w:p>
+            <w:r>
+              <w:rPr>
+                <w:sz w:val="18"/>
+              </w:rPr>
+              <w:t>- Payer denial authority bias. External-source conflict: a structured denial letter can sound definitive while omitting the clinical facts that support skilled care or equipment-level need. Requires synthesis across the denial, therapy data, oxygen testing, case-management notes, and physician documentation. Task-level surface.</w:t>
+            </w:r>
+          </w:p>
+          <w:p>
+            <w:r>
+              <w:rPr>
+                <w:sz w:val="18"/>
+              </w:rPr>
+              <w:t>- Readmission attribution shortcut. Retrospective review risk: a bounceback can be framed as patient nonadherence when the chart shows incomplete equipment delivery, unclear medication ownership, or an unsafe transition plan. Requires synthesis across discharge materials, vendor records, follow-up communication, and readmission documentation. Task-level surface.</w:t>
             </w:r>
           </w:p>
         </w:tc>
@@ -676,7 +548,30 @@
               <w:rPr>
                 <w:sz w:val="18"/>
               </w:rPr>
-              <w:t>ML01. Oxygen and SNF denial appeal</w:t>
+              <w:t>Ten tasks, each an independent post-snapshot encounter, each named with requester, deliverable, workflow family, priority, structure, forced decision, planned trap, and anchor.</w:t>
+            </w:r>
+          </w:p>
+          <w:p>
+            <w:r>
+              <w:rPr>
+                <w:sz w:val="18"/>
+              </w:rPr>
+            </w:r>
+          </w:p>
+          <w:p>
+            <w:r>
+              <w:rPr>
+                <w:sz w:val="18"/>
+              </w:rPr>
+              <w:t>1. Oxygen and SNF denial appeal</w:t>
+            </w:r>
+          </w:p>
+          <w:p>
+            <w:r>
+              <w:rPr>
+                <w:sz w:val="18"/>
+              </w:rPr>
+              <w:t>Requester: Hospitalist attending for case management</w:t>
             </w:r>
           </w:p>
           <w:p>
@@ -692,23 +587,47 @@
               <w:rPr>
                 <w:sz w:val="18"/>
               </w:rPr>
-              <w:t>Task-level file: Payer denial plus quiet transfer-day oxygen or therapy addendum</w:t>
-            </w:r>
-          </w:p>
-          <w:p>
-            <w:r>
-              <w:rPr>
-                <w:sz w:val="18"/>
-              </w:rPr>
-              <w:t>Central catch: Resting saturation does not answer exertional oxygen need or skilled transition risk</w:t>
-            </w:r>
-          </w:p>
-          <w:p>
-            <w:r>
-              <w:rPr>
-                <w:sz w:val="18"/>
-              </w:rPr>
-              <w:t>ML02. Discharge medication reconciliation</w:t>
+              <w:t>Priority and structure: P0, External position review</w:t>
+            </w:r>
+          </w:p>
+          <w:p>
+            <w:r>
+              <w:rPr>
+                <w:sz w:val="18"/>
+              </w:rPr>
+              <w:t>Forced decision: Appeal, accept, or narrow the denial</w:t>
+            </w:r>
+          </w:p>
+          <w:p>
+            <w:r>
+              <w:rPr>
+                <w:sz w:val="18"/>
+              </w:rPr>
+              <w:t>Planned trap: Denial relies on resting oxygen and ignores exertional oxygen need and transition risk</w:t>
+            </w:r>
+          </w:p>
+          <w:p>
+            <w:r>
+              <w:rPr>
+                <w:sz w:val="18"/>
+              </w:rPr>
+              <w:t>Anchor: June 11, 2026 at 09:00</w:t>
+            </w:r>
+          </w:p>
+          <w:p>
+            <w:r>
+              <w:rPr>
+                <w:sz w:val="18"/>
+              </w:rPr>
+              <w:t>2. Discharge medication reconciliation</w:t>
+            </w:r>
+          </w:p>
+          <w:p>
+            <w:r>
+              <w:rPr>
+                <w:sz w:val="18"/>
+              </w:rPr>
+              <w:t>Requester: Hospitalist attending</w:t>
             </w:r>
           </w:p>
           <w:p>
@@ -724,23 +643,47 @@
               <w:rPr>
                 <w:sz w:val="18"/>
               </w:rPr>
-              <w:t>Task-level file: External discharge medication list or SNF intake list</w:t>
-            </w:r>
-          </w:p>
-          <w:p>
-            <w:r>
-              <w:rPr>
-                <w:sz w:val="18"/>
-              </w:rPr>
-              <w:t>Central catch: Stop or correct a stale renal or anticoagulation item while keeping open renal restarts open</w:t>
-            </w:r>
-          </w:p>
-          <w:p>
-            <w:r>
-              <w:rPr>
-                <w:sz w:val="18"/>
-              </w:rPr>
-              <w:t>ML03. Continued-stay review</w:t>
+              <w:t>Priority and structure: P0, Forced inventory</w:t>
+            </w:r>
+          </w:p>
+          <w:p>
+            <w:r>
+              <w:rPr>
+                <w:sz w:val="18"/>
+              </w:rPr>
+              <w:t>Forced decision: Continue, hold, change, stop, or defer per medication row</w:t>
+            </w:r>
+          </w:p>
+          <w:p>
+            <w:r>
+              <w:rPr>
+                <w:sz w:val="18"/>
+              </w:rPr>
+              <w:t>Planned trap: Outside list carries stale renal or anticoagulation logic despite updated kidney function and active orders</w:t>
+            </w:r>
+          </w:p>
+          <w:p>
+            <w:r>
+              <w:rPr>
+                <w:sz w:val="18"/>
+              </w:rPr>
+              <w:t>Anchor: June 11, 2026 at 10:00</w:t>
+            </w:r>
+          </w:p>
+          <w:p>
+            <w:r>
+              <w:rPr>
+                <w:sz w:val="18"/>
+              </w:rPr>
+              <w:t>3. Continued-stay review</w:t>
+            </w:r>
+          </w:p>
+          <w:p>
+            <w:r>
+              <w:rPr>
+                <w:sz w:val="18"/>
+              </w:rPr>
+              <w:t>Requester: Physician advisor</w:t>
             </w:r>
           </w:p>
           <w:p>
@@ -756,23 +699,47 @@
               <w:rPr>
                 <w:sz w:val="18"/>
               </w:rPr>
-              <w:t>Task-level file: Utilization review worksheet with tempting "medically stable" language</w:t>
-            </w:r>
-          </w:p>
-          <w:p>
-            <w:r>
-              <w:rPr>
-                <w:sz w:val="18"/>
-              </w:rPr>
-              <w:t>Central catch: Medical improvement is not transition readiness when oxygen equipment and exertional function remain unresolved</w:t>
-            </w:r>
-          </w:p>
-          <w:p>
-            <w:r>
-              <w:rPr>
-                <w:sz w:val="18"/>
-              </w:rPr>
-              <w:t>ML04. Transition note completion</w:t>
+              <w:t>Priority and structure: P0, Determination</w:t>
+            </w:r>
+          </w:p>
+          <w:p>
+            <w:r>
+              <w:rPr>
+                <w:sz w:val="18"/>
+              </w:rPr>
+              <w:t>Forced decision: Approve continued stay, narrow, or deny</w:t>
+            </w:r>
+          </w:p>
+          <w:p>
+            <w:r>
+              <w:rPr>
+                <w:sz w:val="18"/>
+              </w:rPr>
+              <w:t>Planned trap: Review worksheet treats improvement after diuresis as readiness despite unresolved oxygen equipment and exertional tolerance</w:t>
+            </w:r>
+          </w:p>
+          <w:p>
+            <w:r>
+              <w:rPr>
+                <w:sz w:val="18"/>
+              </w:rPr>
+              <w:t>Anchor: June 11, 2026 at 14:00</w:t>
+            </w:r>
+          </w:p>
+          <w:p>
+            <w:r>
+              <w:rPr>
+                <w:sz w:val="18"/>
+              </w:rPr>
+              <w:t>4. Transition note completion</w:t>
+            </w:r>
+          </w:p>
+          <w:p>
+            <w:r>
+              <w:rPr>
+                <w:sz w:val="18"/>
+              </w:rPr>
+              <w:t>Requester: Discharging attending</w:t>
             </w:r>
           </w:p>
           <w:p>
@@ -788,23 +755,47 @@
               <w:rPr>
                 <w:sz w:val="18"/>
               </w:rPr>
-              <w:t>Task-level file: Started transition note with true blanks and one weak external claim</w:t>
-            </w:r>
-          </w:p>
-          <w:p>
-            <w:r>
-              <w:rPr>
-                <w:sz w:val="18"/>
-              </w:rPr>
-              <w:t>Central catch: Complete the note without closing oxygen, volume, or follow-up items that are still open</w:t>
-            </w:r>
-          </w:p>
-          <w:p>
-            <w:r>
-              <w:rPr>
-                <w:sz w:val="18"/>
-              </w:rPr>
-              <w:t>ML05. Post-acute coordination plan</w:t>
+              <w:t>Priority and structure: P0, Completion, the single completion task</w:t>
+            </w:r>
+          </w:p>
+          <w:p>
+            <w:r>
+              <w:rPr>
+                <w:sz w:val="18"/>
+              </w:rPr>
+              <w:t>Forced decision: Finish open sections without falsely closing readiness</w:t>
+            </w:r>
+          </w:p>
+          <w:p>
+            <w:r>
+              <w:rPr>
+                <w:sz w:val="18"/>
+              </w:rPr>
+              <w:t>Planned trap: Started note leaves oxygen, volume, and follow-up ownership open against a reassuring draft tone</w:t>
+            </w:r>
+          </w:p>
+          <w:p>
+            <w:r>
+              <w:rPr>
+                <w:sz w:val="18"/>
+              </w:rPr>
+              <w:t>Anchor: June 12, 2026 at 08:30</w:t>
+            </w:r>
+          </w:p>
+          <w:p>
+            <w:r>
+              <w:rPr>
+                <w:sz w:val="18"/>
+              </w:rPr>
+              <w:t>5. Post-acute coordination plan</w:t>
+            </w:r>
+          </w:p>
+          <w:p>
+            <w:r>
+              <w:rPr>
+                <w:sz w:val="18"/>
+              </w:rPr>
+              <w:t>Requester: Case manager</w:t>
             </w:r>
           </w:p>
           <w:p>
@@ -820,23 +811,47 @@
               <w:rPr>
                 <w:sz w:val="18"/>
               </w:rPr>
-              <w:t>Task-level file: Case-management handoff draft and DME vendor status</w:t>
-            </w:r>
-          </w:p>
-          <w:p>
-            <w:r>
-              <w:rPr>
-                <w:sz w:val="18"/>
-              </w:rPr>
-              <w:t>Central catch: Identify the missing equipment and owner before signing the transfer plan</w:t>
-            </w:r>
-          </w:p>
-          <w:p>
-            <w:r>
-              <w:rPr>
-                <w:sz w:val="18"/>
-              </w:rPr>
-              <w:t>ML06. Cardiorenal follow-up letter</w:t>
+              <w:t>Priority and structure: P0, Coordination synthesis</w:t>
+            </w:r>
+          </w:p>
+          <w:p>
+            <w:r>
+              <w:rPr>
+                <w:sz w:val="18"/>
+              </w:rPr>
+              <w:t>Forced decision: Assign owner, status, and next action for each transition item</w:t>
+            </w:r>
+          </w:p>
+          <w:p>
+            <w:r>
+              <w:rPr>
+                <w:sz w:val="18"/>
+              </w:rPr>
+              <w:t>Planned trap: Case-management prose says DME arranged while vendor status leaves portable oxygen unresolved</w:t>
+            </w:r>
+          </w:p>
+          <w:p>
+            <w:r>
+              <w:rPr>
+                <w:sz w:val="18"/>
+              </w:rPr>
+              <w:t>Anchor: June 12, 2026 at 13:00</w:t>
+            </w:r>
+          </w:p>
+          <w:p>
+            <w:r>
+              <w:rPr>
+                <w:sz w:val="18"/>
+              </w:rPr>
+              <w:t>6. Cardiorenal follow-up letter</w:t>
+            </w:r>
+          </w:p>
+          <w:p>
+            <w:r>
+              <w:rPr>
+                <w:sz w:val="18"/>
+              </w:rPr>
+              <w:t>Requester: Hospitalist attending</w:t>
             </w:r>
           </w:p>
           <w:p>
@@ -852,23 +867,47 @@
               <w:rPr>
                 <w:sz w:val="18"/>
               </w:rPr>
-              <w:t>Task-level file: Started cardiology-nephrology follow-up note</w:t>
-            </w:r>
-          </w:p>
-          <w:p>
-            <w:r>
-              <w:rPr>
-                <w:sz w:val="18"/>
-              </w:rPr>
-              <w:t>Central catch: Route diuretic, kidney-function, potassium, anticoagulation, and restart decisions to the right follow-up owner</w:t>
-            </w:r>
-          </w:p>
-          <w:p>
-            <w:r>
-              <w:rPr>
-                <w:sz w:val="18"/>
-              </w:rPr>
-              <w:t>ML07. Home health versus SNF appeal</w:t>
+              <w:t>Priority and structure: P0, Specialist handoff</w:t>
+            </w:r>
+          </w:p>
+          <w:p>
+            <w:r>
+              <w:rPr>
+                <w:sz w:val="18"/>
+              </w:rPr>
+              <w:t>Forced decision: Route diuretic, renal labs, potassium, anticoagulation, and restart decisions to the correct owner</w:t>
+            </w:r>
+          </w:p>
+          <w:p>
+            <w:r>
+              <w:rPr>
+                <w:sz w:val="18"/>
+              </w:rPr>
+              <w:t>Planned trap: Follow-up draft makes the plan sound settled while renal and volume decisions remain conditional</w:t>
+            </w:r>
+          </w:p>
+          <w:p>
+            <w:r>
+              <w:rPr>
+                <w:sz w:val="18"/>
+              </w:rPr>
+              <w:t>Anchor: June 13, 2026 at 11:00</w:t>
+            </w:r>
+          </w:p>
+          <w:p>
+            <w:r>
+              <w:rPr>
+                <w:sz w:val="18"/>
+              </w:rPr>
+              <w:t>7. Home health versus SNF appeal</w:t>
+            </w:r>
+          </w:p>
+          <w:p>
+            <w:r>
+              <w:rPr>
+                <w:sz w:val="18"/>
+              </w:rPr>
+              <w:t>Requester: Hospitalist attending for utilization management</w:t>
             </w:r>
           </w:p>
           <w:p>
@@ -884,23 +923,47 @@
               <w:rPr>
                 <w:sz w:val="18"/>
               </w:rPr>
-              <w:t>Task-level file: Home-health denial response packet</w:t>
-            </w:r>
-          </w:p>
-          <w:p>
-            <w:r>
-              <w:rPr>
-                <w:sz w:val="18"/>
-              </w:rPr>
-              <w:t>Central catch: Show why home health does not meet oxygen, monitoring, and functional needs without overstating the chart</w:t>
-            </w:r>
-          </w:p>
-          <w:p>
-            <w:r>
-              <w:rPr>
-                <w:sz w:val="18"/>
-              </w:rPr>
-              <w:t>ML08. Safety event review after bounceback</w:t>
+              <w:t>Priority and structure: P0, External position review</w:t>
+            </w:r>
+          </w:p>
+          <w:p>
+            <w:r>
+              <w:rPr>
+                <w:sz w:val="18"/>
+              </w:rPr>
+              <w:t>Forced decision: Support skilled need or accept home-health pathway</w:t>
+            </w:r>
+          </w:p>
+          <w:p>
+            <w:r>
+              <w:rPr>
+                <w:sz w:val="18"/>
+              </w:rPr>
+              <w:t>Planned trap: Denial treats home health as sufficient despite stairs, oxygen burden, functional limits, and medication complexity</w:t>
+            </w:r>
+          </w:p>
+          <w:p>
+            <w:r>
+              <w:rPr>
+                <w:sz w:val="18"/>
+              </w:rPr>
+              <w:t>Anchor: June 15, 2026 at 10:00</w:t>
+            </w:r>
+          </w:p>
+          <w:p>
+            <w:r>
+              <w:rPr>
+                <w:sz w:val="18"/>
+              </w:rPr>
+              <w:t>8. Safety review after bounceback</w:t>
+            </w:r>
+          </w:p>
+          <w:p>
+            <w:r>
+              <w:rPr>
+                <w:sz w:val="18"/>
+              </w:rPr>
+              <w:t>Requester: Patient safety officer</w:t>
             </w:r>
           </w:p>
           <w:p>
@@ -916,23 +979,47 @@
               <w:rPr>
                 <w:sz w:val="18"/>
               </w:rPr>
-              <w:t>Task-level file: Readmission event note and equipment delivery record</w:t>
-            </w:r>
-          </w:p>
-          <w:p>
-            <w:r>
-              <w:rPr>
-                <w:sz w:val="18"/>
-              </w:rPr>
-              <w:t>Central catch: Attribute the event to the unsafe transition gap, not patient nonadherence</w:t>
-            </w:r>
-          </w:p>
-          <w:p>
-            <w:r>
-              <w:rPr>
-                <w:sz w:val="18"/>
-              </w:rPr>
-              <w:t>ML09. Quality abstraction review</w:t>
+              <w:t>Priority and structure: P0, Investigation</w:t>
+            </w:r>
+          </w:p>
+          <w:p>
+            <w:r>
+              <w:rPr>
+                <w:sz w:val="18"/>
+              </w:rPr>
+              <w:t>Forced decision: Identify likely cause and prevention steps</w:t>
+            </w:r>
+          </w:p>
+          <w:p>
+            <w:r>
+              <w:rPr>
+                <w:sz w:val="18"/>
+              </w:rPr>
+              <w:t>Planned trap: Initial event note blames nonadherence while the record supports equipment or handoff failure</w:t>
+            </w:r>
+          </w:p>
+          <w:p>
+            <w:r>
+              <w:rPr>
+                <w:sz w:val="18"/>
+              </w:rPr>
+              <w:t>Anchor: June 16, 2026 at 09:00</w:t>
+            </w:r>
+          </w:p>
+          <w:p>
+            <w:r>
+              <w:rPr>
+                <w:sz w:val="18"/>
+              </w:rPr>
+              <w:t>9. Heart-failure transition quality abstraction</w:t>
+            </w:r>
+          </w:p>
+          <w:p>
+            <w:r>
+              <w:rPr>
+                <w:sz w:val="18"/>
+              </w:rPr>
+              <w:t>Requester: Quality abstraction nurse</w:t>
             </w:r>
           </w:p>
           <w:p>
@@ -948,132 +1035,102 @@
               <w:rPr>
                 <w:sz w:val="18"/>
               </w:rPr>
-              <w:t>Task-level file: Abstractor worksheet with source conflicts</w:t>
-            </w:r>
-          </w:p>
-          <w:p>
-            <w:r>
-              <w:rPr>
-                <w:sz w:val="18"/>
-              </w:rPr>
-              <w:t>Central catch: Abstract the documented measure only, and do not award a clean transition when key evidence is missing</w:t>
-            </w:r>
-          </w:p>
-          <w:p>
-            <w:r>
-              <w:rPr>
-                <w:sz w:val="18"/>
-              </w:rPr>
-              <w:t>ML10. Documentation query response</w:t>
-            </w:r>
-          </w:p>
-          <w:p>
-            <w:r>
-              <w:rPr>
-                <w:sz w:val="18"/>
-              </w:rPr>
-              <w:t>Workflow: Clinical Documentation Improvement Query Response Review</w:t>
-            </w:r>
-          </w:p>
-          <w:p>
-            <w:r>
-              <w:rPr>
-                <w:sz w:val="18"/>
-              </w:rPr>
-              <w:t>Task-level file: CDI query about acute hypoxic respiratory failure or cardiorenal AKI</w:t>
-            </w:r>
-          </w:p>
-          <w:p>
-            <w:r>
-              <w:rPr>
-                <w:sz w:val="18"/>
-              </w:rPr>
-              <w:t>Central catch: Answer with supported specificity while rejecting unsupported over-claims</w:t>
-            </w:r>
-          </w:p>
-          <w:p>
-            <w:r>
-              <w:rPr>
-                <w:sz w:val="18"/>
-              </w:rPr>
-            </w:r>
-          </w:p>
-          <w:p>
-            <w:r>
-              <w:rPr>
-                <w:sz w:val="18"/>
-              </w:rPr>
-              <w:t>The model will be strong at reading heart-failure notes, pulling labs, naming the medication classes, and writing a polished discharge plan. That is not enough here. The failure axis is readiness under contradiction. The world should force the model to decide whether an apparently clean plan can be signed when one quiet fact changes the transition.</w:t>
-            </w:r>
-          </w:p>
-          <w:p>
-            <w:r>
-              <w:rPr>
-                <w:sz w:val="18"/>
-              </w:rPr>
-            </w:r>
-          </w:p>
-          <w:p>
-            <w:r>
-              <w:rPr>
-                <w:sz w:val="18"/>
-              </w:rPr>
-              <w:t>The target shape is bimodal. Catcher runs should open the task-level file, reconcile the hidden conflict, and make a safe next move. Floor runs should summarize the chart accurately but sign the wrong thing because they trusted the most recent or most official-looking document.</w:t>
-            </w:r>
-          </w:p>
-          <w:p>
-            <w:r>
-              <w:rPr>
-                <w:sz w:val="18"/>
-              </w:rPr>
-            </w:r>
-          </w:p>
-          <w:p>
-            <w:r>
-              <w:rPr>
-                <w:sz w:val="18"/>
-              </w:rPr>
-              <w:t>- Keep race clinically contextual, not decorative and not used as a biological shortcut.</w:t>
-            </w:r>
-          </w:p>
-          <w:p>
-            <w:r>
-              <w:rPr>
-                <w:sz w:val="18"/>
-              </w:rPr>
-              <w:t>- Do not make the patient unsafe by silence alone. The chart must contradict the wrong move.</w:t>
-            </w:r>
-          </w:p>
-          <w:p>
-            <w:r>
-              <w:rPr>
-                <w:sz w:val="18"/>
-              </w:rPr>
-              <w:t>- Do not build traps that require public web search or post-July 2025 knowledge.</w:t>
-            </w:r>
-          </w:p>
-          <w:p>
-            <w:r>
-              <w:rPr>
-                <w:sz w:val="18"/>
-              </w:rPr>
-              <w:t>- Use task-level files for post-snapshot denials, drafts, vendor notes, reports, or event notes.</w:t>
-            </w:r>
-          </w:p>
-          <w:p>
-            <w:r>
-              <w:rPr>
-                <w:sz w:val="18"/>
-              </w:rPr>
-              <w:t>- Keep world files free of task answers.</w:t>
-            </w:r>
-          </w:p>
-          <w:p>
-            <w:r>
-              <w:rPr>
-                <w:sz w:val="18"/>
-              </w:rPr>
-              <w:t>- Prefer one forced wrong move per task. The rest of the work can be ordinary, realistic clinical completion.</w:t>
+              <w:t>Priority and structure: P1, Extraction to schema</w:t>
+            </w:r>
+          </w:p>
+          <w:p>
+            <w:r>
+              <w:rPr>
+                <w:sz w:val="18"/>
+              </w:rPr>
+              <w:t>Forced decision: Record documented value, exclusion, or unable-to-determine per field</w:t>
+            </w:r>
+          </w:p>
+          <w:p>
+            <w:r>
+              <w:rPr>
+                <w:sz w:val="18"/>
+              </w:rPr>
+              <w:t>Planned trap: Abstractor worksheet rewards a clean transition although oxygen or follow-up evidence is incomplete</w:t>
+            </w:r>
+          </w:p>
+          <w:p>
+            <w:r>
+              <w:rPr>
+                <w:sz w:val="18"/>
+              </w:rPr>
+              <w:t>Anchor: June 17, 2026 at 09:00</w:t>
+            </w:r>
+          </w:p>
+          <w:p>
+            <w:r>
+              <w:rPr>
+                <w:sz w:val="18"/>
+              </w:rPr>
+              <w:t>10. Documentation query response</w:t>
+            </w:r>
+          </w:p>
+          <w:p>
+            <w:r>
+              <w:rPr>
+                <w:sz w:val="18"/>
+              </w:rPr>
+              <w:t>Requester: CDI specialist</w:t>
+            </w:r>
+          </w:p>
+          <w:p>
+            <w:r>
+              <w:rPr>
+                <w:sz w:val="18"/>
+              </w:rPr>
+              <w:t>Workflow: Clinical Documentation Improvement (CDI) Query Response Review</w:t>
+            </w:r>
+          </w:p>
+          <w:p>
+            <w:r>
+              <w:rPr>
+                <w:sz w:val="18"/>
+              </w:rPr>
+              <w:t>Priority and structure: P1, Query response</w:t>
+            </w:r>
+          </w:p>
+          <w:p>
+            <w:r>
+              <w:rPr>
+                <w:sz w:val="18"/>
+              </w:rPr>
+              <w:t>Forced decision: Agree, decline, or clarify supported specificity</w:t>
+            </w:r>
+          </w:p>
+          <w:p>
+            <w:r>
+              <w:rPr>
+                <w:sz w:val="18"/>
+              </w:rPr>
+              <w:t>Planned trap: Query asks for over-specific acute respiratory failure or cardiorenal diagnosis language beyond the treating record</w:t>
+            </w:r>
+          </w:p>
+          <w:p>
+            <w:r>
+              <w:rPr>
+                <w:sz w:val="18"/>
+              </w:rPr>
+              <w:t>Anchor: June 17, 2026 at 12:00</w:t>
+            </w:r>
+          </w:p>
+          <w:p>
+            <w:r>
+              <w:rPr>
+                <w:sz w:val="18"/>
+              </w:rPr>
+            </w:r>
+          </w:p>
+          <w:p>
+            <w:r>
+              <w:rPr>
+                <w:sz w:val="18"/>
+              </w:rPr>
+              <w:t>Structure spread: external position review x2, forced inventory, determination, completion x1, coordination synthesis, specialist handoff, investigation, extraction to schema, and query response. The shared chart stays raw, with no single summary that states the final readiness conclusion. Later administrative, quality, referral, and safety tasks branch independently from the same approved world snapshot and their own requester materials; they are not sequential outputs of earlier tasks.</w:t>
             </w:r>
           </w:p>
         </w:tc>

</xml_diff>

<commit_message>
Canonicalize clinical date ceiling
</commit_message>
<xml_diff>
--- a/worlds/marva-lydell/submission/Marva_Lydell_Brainstorm.docx
+++ b/worlds/marva-lydell/submission/Marva_Lydell_Brainstorm.docx
@@ -13,7 +13,7 @@
     </w:p>
     <w:p>
       <w:r>
-        <w:t>Document date: June 18, 2026</w:t>
+        <w:t>Document date: July 18, 2025</w:t>
       </w:r>
     </w:p>
     <w:tbl>
@@ -175,7 +175,7 @@
               <w:rPr>
                 <w:sz w:val="18"/>
               </w:rPr>
-              <w:t>Concept pitch for Team Lead review. World Type: Typical Clinical World (inpatient hospital medicine with post-discharge administrative and transition encounters). Snapshot: June 10, 2026 at 18:00. Patient: Marva Lydell, 72F. June 18, 2026.</w:t>
+              <w:t>Concept pitch for Team Lead review. World Type: Typical Clinical World (inpatient hospital medicine with post-discharge administrative and transition encounters). Snapshot: July 10, 2025 at 18:00. Patient: Marva Lydell, 72F. Document date: July 18, 2025.</w:t>
             </w:r>
           </w:p>
           <w:p>
@@ -205,7 +205,7 @@
               <w:rPr>
                 <w:sz w:val="18"/>
               </w:rPr>
-              <w:t>The world snapshot closes on June 10, 2026 at 18:00, at the point of realistic tension: she is clinically improved at rest, but transition safety remains unresolved. Creatinine is improving, resting oxygen saturation looks acceptable, and the discharge plan appears close. The unresolved issues are exertional oxygen need, portable oxygen delivery, diuretic and renal-medication follow-up, anticoagulation source hierarchy, functional tolerance, and the limits of home support. Every task is an independent encounter anchored after the snapshot. Each task can be answered from the planned chart, payer, respiratory therapy, pharmacy, case management, therapy, quality, and post-acute materials available to that requester.</w:t>
+              <w:t>The world snapshot closes on July 10, 2025 at 18:00, at the point of realistic tension: she is clinically improved at rest, but transition safety remains unresolved. Creatinine is improving, resting oxygen saturation looks acceptable, and the discharge plan appears close. The unresolved issues are exertional oxygen need, portable oxygen delivery, diuretic and renal-medication follow-up, anticoagulation source hierarchy, functional tolerance, and the limits of home support. Every task is an independent encounter anchored after the snapshot. Each task can be answered from the planned chart, payer, respiratory therapy, pharmacy, case management, therapy, quality, and post-acute materials available to that requester.</w:t>
             </w:r>
           </w:p>
         </w:tc>
@@ -548,7 +548,7 @@
               <w:rPr>
                 <w:sz w:val="18"/>
               </w:rPr>
-              <w:t>Ten tasks, each an independent post-snapshot encounter, each named with requester, deliverable, workflow family, priority, structure, forced decision, planned trap, and anchor.</w:t>
+              <w:t>Ten tasks, each an independent post-snapshot encounter, each named with requester, deliverable, workflow family, structure, forced decision, clinical trap, and anchor.</w:t>
             </w:r>
           </w:p>
           <w:p>
@@ -587,31 +587,31 @@
               <w:rPr>
                 <w:sz w:val="18"/>
               </w:rPr>
-              <w:t>Priority and structure: P0, External position review</w:t>
-            </w:r>
-          </w:p>
-          <w:p>
-            <w:r>
-              <w:rPr>
-                <w:sz w:val="18"/>
-              </w:rPr>
-              <w:t>Forced decision: Appeal, accept, or narrow the denial</w:t>
-            </w:r>
-          </w:p>
-          <w:p>
-            <w:r>
-              <w:rPr>
-                <w:sz w:val="18"/>
-              </w:rPr>
-              <w:t>Planned trap: Denial relies on resting oxygen and ignores exertional oxygen need and transition risk</w:t>
-            </w:r>
-          </w:p>
-          <w:p>
-            <w:r>
-              <w:rPr>
-                <w:sz w:val="18"/>
-              </w:rPr>
-              <w:t>Anchor: June 11, 2026 at 09:00</w:t>
+              <w:t>Structure: External position review</w:t>
+            </w:r>
+          </w:p>
+          <w:p>
+            <w:r>
+              <w:rPr>
+                <w:sz w:val="18"/>
+              </w:rPr>
+              <w:t>Required decision: Appeal, accept, or narrow the denial</w:t>
+            </w:r>
+          </w:p>
+          <w:p>
+            <w:r>
+              <w:rPr>
+                <w:sz w:val="18"/>
+              </w:rPr>
+              <w:t>Clinical trap: Denial relies on resting oxygen and ignores exertional oxygen need and transition risk</w:t>
+            </w:r>
+          </w:p>
+          <w:p>
+            <w:r>
+              <w:rPr>
+                <w:sz w:val="18"/>
+              </w:rPr>
+              <w:t>Anchor: July 11, 2025 at 09:00</w:t>
             </w:r>
           </w:p>
           <w:p>
@@ -643,31 +643,31 @@
               <w:rPr>
                 <w:sz w:val="18"/>
               </w:rPr>
-              <w:t>Priority and structure: P0, Forced inventory</w:t>
-            </w:r>
-          </w:p>
-          <w:p>
-            <w:r>
-              <w:rPr>
-                <w:sz w:val="18"/>
-              </w:rPr>
-              <w:t>Forced decision: Continue, hold, change, stop, or defer per medication row</w:t>
-            </w:r>
-          </w:p>
-          <w:p>
-            <w:r>
-              <w:rPr>
-                <w:sz w:val="18"/>
-              </w:rPr>
-              <w:t>Planned trap: Outside list carries stale renal or anticoagulation logic despite updated kidney function and active orders</w:t>
-            </w:r>
-          </w:p>
-          <w:p>
-            <w:r>
-              <w:rPr>
-                <w:sz w:val="18"/>
-              </w:rPr>
-              <w:t>Anchor: June 11, 2026 at 10:00</w:t>
+              <w:t>Structure: Forced inventory</w:t>
+            </w:r>
+          </w:p>
+          <w:p>
+            <w:r>
+              <w:rPr>
+                <w:sz w:val="18"/>
+              </w:rPr>
+              <w:t>Required decision: Continue, hold, change, stop, or defer per medication row</w:t>
+            </w:r>
+          </w:p>
+          <w:p>
+            <w:r>
+              <w:rPr>
+                <w:sz w:val="18"/>
+              </w:rPr>
+              <w:t>Clinical trap: Outside list carries stale renal or anticoagulation logic despite updated kidney function and active orders</w:t>
+            </w:r>
+          </w:p>
+          <w:p>
+            <w:r>
+              <w:rPr>
+                <w:sz w:val="18"/>
+              </w:rPr>
+              <w:t>Anchor: July 11, 2025 at 10:00</w:t>
             </w:r>
           </w:p>
           <w:p>
@@ -699,31 +699,31 @@
               <w:rPr>
                 <w:sz w:val="18"/>
               </w:rPr>
-              <w:t>Priority and structure: P0, Determination</w:t>
-            </w:r>
-          </w:p>
-          <w:p>
-            <w:r>
-              <w:rPr>
-                <w:sz w:val="18"/>
-              </w:rPr>
-              <w:t>Forced decision: Approve continued stay, narrow, or deny</w:t>
-            </w:r>
-          </w:p>
-          <w:p>
-            <w:r>
-              <w:rPr>
-                <w:sz w:val="18"/>
-              </w:rPr>
-              <w:t>Planned trap: Review worksheet treats improvement after diuresis as readiness despite unresolved oxygen equipment and exertional tolerance</w:t>
-            </w:r>
-          </w:p>
-          <w:p>
-            <w:r>
-              <w:rPr>
-                <w:sz w:val="18"/>
-              </w:rPr>
-              <w:t>Anchor: June 11, 2026 at 14:00</w:t>
+              <w:t>Structure: Determination</w:t>
+            </w:r>
+          </w:p>
+          <w:p>
+            <w:r>
+              <w:rPr>
+                <w:sz w:val="18"/>
+              </w:rPr>
+              <w:t>Required decision: Approve continued stay, narrow, or deny</w:t>
+            </w:r>
+          </w:p>
+          <w:p>
+            <w:r>
+              <w:rPr>
+                <w:sz w:val="18"/>
+              </w:rPr>
+              <w:t>Clinical trap: Review worksheet treats improvement after diuresis as readiness despite unresolved oxygen equipment and exertional tolerance</w:t>
+            </w:r>
+          </w:p>
+          <w:p>
+            <w:r>
+              <w:rPr>
+                <w:sz w:val="18"/>
+              </w:rPr>
+              <w:t>Anchor: July 11, 2025 at 14:00</w:t>
             </w:r>
           </w:p>
           <w:p>
@@ -755,31 +755,31 @@
               <w:rPr>
                 <w:sz w:val="18"/>
               </w:rPr>
-              <w:t>Priority and structure: P0, Completion, the single completion task</w:t>
-            </w:r>
-          </w:p>
-          <w:p>
-            <w:r>
-              <w:rPr>
-                <w:sz w:val="18"/>
-              </w:rPr>
-              <w:t>Forced decision: Finish open sections without falsely closing readiness</w:t>
-            </w:r>
-          </w:p>
-          <w:p>
-            <w:r>
-              <w:rPr>
-                <w:sz w:val="18"/>
-              </w:rPr>
-              <w:t>Planned trap: Started note leaves oxygen, volume, and follow-up ownership open against a reassuring draft tone</w:t>
-            </w:r>
-          </w:p>
-          <w:p>
-            <w:r>
-              <w:rPr>
-                <w:sz w:val="18"/>
-              </w:rPr>
-              <w:t>Anchor: June 12, 2026 at 08:30</w:t>
+              <w:t>Structure: Completion, the single completion task</w:t>
+            </w:r>
+          </w:p>
+          <w:p>
+            <w:r>
+              <w:rPr>
+                <w:sz w:val="18"/>
+              </w:rPr>
+              <w:t>Required decision: Finish open sections without falsely closing readiness</w:t>
+            </w:r>
+          </w:p>
+          <w:p>
+            <w:r>
+              <w:rPr>
+                <w:sz w:val="18"/>
+              </w:rPr>
+              <w:t>Clinical trap: Started note leaves oxygen, volume, and follow-up ownership open against a reassuring draft tone</w:t>
+            </w:r>
+          </w:p>
+          <w:p>
+            <w:r>
+              <w:rPr>
+                <w:sz w:val="18"/>
+              </w:rPr>
+              <w:t>Anchor: July 12, 2025 at 08:30</w:t>
             </w:r>
           </w:p>
           <w:p>
@@ -811,31 +811,31 @@
               <w:rPr>
                 <w:sz w:val="18"/>
               </w:rPr>
-              <w:t>Priority and structure: P0, Coordination synthesis</w:t>
-            </w:r>
-          </w:p>
-          <w:p>
-            <w:r>
-              <w:rPr>
-                <w:sz w:val="18"/>
-              </w:rPr>
-              <w:t>Forced decision: Assign owner, status, and next action for each transition item</w:t>
-            </w:r>
-          </w:p>
-          <w:p>
-            <w:r>
-              <w:rPr>
-                <w:sz w:val="18"/>
-              </w:rPr>
-              <w:t>Planned trap: Case-management prose says DME arranged while vendor status leaves portable oxygen unresolved</w:t>
-            </w:r>
-          </w:p>
-          <w:p>
-            <w:r>
-              <w:rPr>
-                <w:sz w:val="18"/>
-              </w:rPr>
-              <w:t>Anchor: June 12, 2026 at 13:00</w:t>
+              <w:t>Structure: Coordination synthesis</w:t>
+            </w:r>
+          </w:p>
+          <w:p>
+            <w:r>
+              <w:rPr>
+                <w:sz w:val="18"/>
+              </w:rPr>
+              <w:t>Required decision: Assign owner, status, and next action for each transition item</w:t>
+            </w:r>
+          </w:p>
+          <w:p>
+            <w:r>
+              <w:rPr>
+                <w:sz w:val="18"/>
+              </w:rPr>
+              <w:t>Clinical trap: Case-management prose says DME arranged while vendor status leaves portable oxygen unresolved</w:t>
+            </w:r>
+          </w:p>
+          <w:p>
+            <w:r>
+              <w:rPr>
+                <w:sz w:val="18"/>
+              </w:rPr>
+              <w:t>Anchor: July 12, 2025 at 13:00</w:t>
             </w:r>
           </w:p>
           <w:p>
@@ -867,31 +867,31 @@
               <w:rPr>
                 <w:sz w:val="18"/>
               </w:rPr>
-              <w:t>Priority and structure: P0, Specialist handoff</w:t>
-            </w:r>
-          </w:p>
-          <w:p>
-            <w:r>
-              <w:rPr>
-                <w:sz w:val="18"/>
-              </w:rPr>
-              <w:t>Forced decision: Route diuretic, renal labs, potassium, anticoagulation, and restart decisions to the correct owner</w:t>
-            </w:r>
-          </w:p>
-          <w:p>
-            <w:r>
-              <w:rPr>
-                <w:sz w:val="18"/>
-              </w:rPr>
-              <w:t>Planned trap: Follow-up draft makes the plan sound settled while renal and volume decisions remain conditional</w:t>
-            </w:r>
-          </w:p>
-          <w:p>
-            <w:r>
-              <w:rPr>
-                <w:sz w:val="18"/>
-              </w:rPr>
-              <w:t>Anchor: June 13, 2026 at 11:00</w:t>
+              <w:t>Structure: Specialist handoff</w:t>
+            </w:r>
+          </w:p>
+          <w:p>
+            <w:r>
+              <w:rPr>
+                <w:sz w:val="18"/>
+              </w:rPr>
+              <w:t>Required decision: Route diuretic, renal labs, potassium, anticoagulation, and restart decisions to the correct owner</w:t>
+            </w:r>
+          </w:p>
+          <w:p>
+            <w:r>
+              <w:rPr>
+                <w:sz w:val="18"/>
+              </w:rPr>
+              <w:t>Clinical trap: Follow-up draft makes the plan sound settled while renal and volume decisions remain conditional</w:t>
+            </w:r>
+          </w:p>
+          <w:p>
+            <w:r>
+              <w:rPr>
+                <w:sz w:val="18"/>
+              </w:rPr>
+              <w:t>Anchor: July 13, 2025 at 11:00</w:t>
             </w:r>
           </w:p>
           <w:p>
@@ -923,31 +923,31 @@
               <w:rPr>
                 <w:sz w:val="18"/>
               </w:rPr>
-              <w:t>Priority and structure: P0, External position review</w:t>
-            </w:r>
-          </w:p>
-          <w:p>
-            <w:r>
-              <w:rPr>
-                <w:sz w:val="18"/>
-              </w:rPr>
-              <w:t>Forced decision: Support skilled need or accept home-health pathway</w:t>
-            </w:r>
-          </w:p>
-          <w:p>
-            <w:r>
-              <w:rPr>
-                <w:sz w:val="18"/>
-              </w:rPr>
-              <w:t>Planned trap: Denial treats home health as sufficient despite stairs, oxygen burden, functional limits, and medication complexity</w:t>
-            </w:r>
-          </w:p>
-          <w:p>
-            <w:r>
-              <w:rPr>
-                <w:sz w:val="18"/>
-              </w:rPr>
-              <w:t>Anchor: June 15, 2026 at 10:00</w:t>
+              <w:t>Structure: External position review</w:t>
+            </w:r>
+          </w:p>
+          <w:p>
+            <w:r>
+              <w:rPr>
+                <w:sz w:val="18"/>
+              </w:rPr>
+              <w:t>Required decision: Support skilled need or accept home-health pathway</w:t>
+            </w:r>
+          </w:p>
+          <w:p>
+            <w:r>
+              <w:rPr>
+                <w:sz w:val="18"/>
+              </w:rPr>
+              <w:t>Clinical trap: Denial treats home health as sufficient despite stairs, oxygen burden, functional limits, and medication complexity</w:t>
+            </w:r>
+          </w:p>
+          <w:p>
+            <w:r>
+              <w:rPr>
+                <w:sz w:val="18"/>
+              </w:rPr>
+              <w:t>Anchor: July 15, 2025 at 10:00</w:t>
             </w:r>
           </w:p>
           <w:p>
@@ -979,31 +979,31 @@
               <w:rPr>
                 <w:sz w:val="18"/>
               </w:rPr>
-              <w:t>Priority and structure: P0, Investigation</w:t>
-            </w:r>
-          </w:p>
-          <w:p>
-            <w:r>
-              <w:rPr>
-                <w:sz w:val="18"/>
-              </w:rPr>
-              <w:t>Forced decision: Identify likely cause and prevention steps</w:t>
-            </w:r>
-          </w:p>
-          <w:p>
-            <w:r>
-              <w:rPr>
-                <w:sz w:val="18"/>
-              </w:rPr>
-              <w:t>Planned trap: Initial event note blames nonadherence while the record supports equipment or handoff failure</w:t>
-            </w:r>
-          </w:p>
-          <w:p>
-            <w:r>
-              <w:rPr>
-                <w:sz w:val="18"/>
-              </w:rPr>
-              <w:t>Anchor: June 16, 2026 at 09:00</w:t>
+              <w:t>Structure: Investigation</w:t>
+            </w:r>
+          </w:p>
+          <w:p>
+            <w:r>
+              <w:rPr>
+                <w:sz w:val="18"/>
+              </w:rPr>
+              <w:t>Required decision: Identify likely cause and prevention steps</w:t>
+            </w:r>
+          </w:p>
+          <w:p>
+            <w:r>
+              <w:rPr>
+                <w:sz w:val="18"/>
+              </w:rPr>
+              <w:t>Clinical trap: Initial event note blames nonadherence while the record supports equipment or handoff failure</w:t>
+            </w:r>
+          </w:p>
+          <w:p>
+            <w:r>
+              <w:rPr>
+                <w:sz w:val="18"/>
+              </w:rPr>
+              <w:t>Anchor: July 16, 2025 at 09:00</w:t>
             </w:r>
           </w:p>
           <w:p>
@@ -1035,31 +1035,31 @@
               <w:rPr>
                 <w:sz w:val="18"/>
               </w:rPr>
-              <w:t>Priority and structure: P1, Extraction to schema</w:t>
-            </w:r>
-          </w:p>
-          <w:p>
-            <w:r>
-              <w:rPr>
-                <w:sz w:val="18"/>
-              </w:rPr>
-              <w:t>Forced decision: Record documented value, exclusion, or unable-to-determine per field</w:t>
-            </w:r>
-          </w:p>
-          <w:p>
-            <w:r>
-              <w:rPr>
-                <w:sz w:val="18"/>
-              </w:rPr>
-              <w:t>Planned trap: Abstractor worksheet rewards a clean transition although oxygen or follow-up evidence is incomplete</w:t>
-            </w:r>
-          </w:p>
-          <w:p>
-            <w:r>
-              <w:rPr>
-                <w:sz w:val="18"/>
-              </w:rPr>
-              <w:t>Anchor: June 17, 2026 at 09:00</w:t>
+              <w:t>Structure: Extraction to schema</w:t>
+            </w:r>
+          </w:p>
+          <w:p>
+            <w:r>
+              <w:rPr>
+                <w:sz w:val="18"/>
+              </w:rPr>
+              <w:t>Required decision: Record documented value, exclusion, or unable-to-determine per field</w:t>
+            </w:r>
+          </w:p>
+          <w:p>
+            <w:r>
+              <w:rPr>
+                <w:sz w:val="18"/>
+              </w:rPr>
+              <w:t>Clinical trap: Abstractor worksheet rewards a clean transition although oxygen or follow-up evidence is incomplete</w:t>
+            </w:r>
+          </w:p>
+          <w:p>
+            <w:r>
+              <w:rPr>
+                <w:sz w:val="18"/>
+              </w:rPr>
+              <w:t>Anchor: July 17, 2025 at 09:00</w:t>
             </w:r>
           </w:p>
           <w:p>
@@ -1091,31 +1091,31 @@
               <w:rPr>
                 <w:sz w:val="18"/>
               </w:rPr>
-              <w:t>Priority and structure: P1, Query response</w:t>
-            </w:r>
-          </w:p>
-          <w:p>
-            <w:r>
-              <w:rPr>
-                <w:sz w:val="18"/>
-              </w:rPr>
-              <w:t>Forced decision: Agree, decline, or clarify supported specificity</w:t>
-            </w:r>
-          </w:p>
-          <w:p>
-            <w:r>
-              <w:rPr>
-                <w:sz w:val="18"/>
-              </w:rPr>
-              <w:t>Planned trap: Query asks for over-specific acute respiratory failure or cardiorenal diagnosis language beyond the treating record</w:t>
-            </w:r>
-          </w:p>
-          <w:p>
-            <w:r>
-              <w:rPr>
-                <w:sz w:val="18"/>
-              </w:rPr>
-              <w:t>Anchor: June 17, 2026 at 12:00</w:t>
+              <w:t>Structure: Query response</w:t>
+            </w:r>
+          </w:p>
+          <w:p>
+            <w:r>
+              <w:rPr>
+                <w:sz w:val="18"/>
+              </w:rPr>
+              <w:t>Required decision: Agree, decline, or clarify supported specificity</w:t>
+            </w:r>
+          </w:p>
+          <w:p>
+            <w:r>
+              <w:rPr>
+                <w:sz w:val="18"/>
+              </w:rPr>
+              <w:t>Clinical trap: Query asks for over-specific acute respiratory failure or cardiorenal diagnosis language beyond the treating record</w:t>
+            </w:r>
+          </w:p>
+          <w:p>
+            <w:r>
+              <w:rPr>
+                <w:sz w:val="18"/>
+              </w:rPr>
+              <w:t>Anchor: July 17, 2025 at 12:00</w:t>
             </w:r>
           </w:p>
           <w:p>

</xml_diff>

<commit_message>
Rebuild Marva brainstorm .docx from corrected .md: fix the table mapper for the new 9-col Priority layout (was dropping the anchor + mis-labeling columns), and wire verify_no_km_identifiers + verify_no_synthetic into the build. All gates green: chrome fingerprint matches base, metadata scrubbed, zero KM/cross-world identifiers, zero register/PO/dash leaks
</commit_message>
<xml_diff>
--- a/worlds/marva-lydell/submission/Marva_Lydell_Brainstorm.docx
+++ b/worlds/marva-lydell/submission/Marva_Lydell_Brainstorm.docx
@@ -548,7 +548,7 @@
               <w:rPr>
                 <w:sz w:val="18"/>
               </w:rPr>
-              <w:t>Ten tasks, each an independent post-snapshot encounter, each named with requester, deliverable, workflow family, structure, forced decision, clinical trap, and anchor.</w:t>
+              <w:t>Ten tasks, each an independent post-snapshot encounter, each named with requester, deliverable, workflow family, priority, structure, forced decision, clinical trap, and anchor.</w:t>
             </w:r>
           </w:p>
           <w:p>
@@ -587,6 +587,14 @@
               <w:rPr>
                 <w:sz w:val="18"/>
               </w:rPr>
+              <w:t>Priority: P0</w:t>
+            </w:r>
+          </w:p>
+          <w:p>
+            <w:r>
+              <w:rPr>
+                <w:sz w:val="18"/>
+              </w:rPr>
               <w:t>Structure: External position review</w:t>
             </w:r>
           </w:p>
@@ -635,7 +643,15 @@
               <w:rPr>
                 <w:sz w:val="18"/>
               </w:rPr>
-              <w:t>Workflow: Discharge Medication Reconciliation at Care Transitions</w:t>
+              <w:t>Workflow: Medication Reconciliation</w:t>
+            </w:r>
+          </w:p>
+          <w:p>
+            <w:r>
+              <w:rPr>
+                <w:sz w:val="18"/>
+              </w:rPr>
+              <w:t>Priority: P0</w:t>
             </w:r>
           </w:p>
           <w:p>
@@ -699,6 +715,14 @@
               <w:rPr>
                 <w:sz w:val="18"/>
               </w:rPr>
+              <w:t>Priority: P0</w:t>
+            </w:r>
+          </w:p>
+          <w:p>
+            <w:r>
+              <w:rPr>
+                <w:sz w:val="18"/>
+              </w:rPr>
               <w:t>Structure: Determination</w:t>
             </w:r>
           </w:p>
@@ -755,6 +779,14 @@
               <w:rPr>
                 <w:sz w:val="18"/>
               </w:rPr>
+              <w:t>Priority: P1</w:t>
+            </w:r>
+          </w:p>
+          <w:p>
+            <w:r>
+              <w:rPr>
+                <w:sz w:val="18"/>
+              </w:rPr>
               <w:t>Structure: Completion, the single completion task</w:t>
             </w:r>
           </w:p>
@@ -811,6 +843,14 @@
               <w:rPr>
                 <w:sz w:val="18"/>
               </w:rPr>
+              <w:t>Priority: P0</w:t>
+            </w:r>
+          </w:p>
+          <w:p>
+            <w:r>
+              <w:rPr>
+                <w:sz w:val="18"/>
+              </w:rPr>
               <w:t>Structure: Coordination synthesis</w:t>
             </w:r>
           </w:p>
@@ -859,7 +899,15 @@
               <w:rPr>
                 <w:sz w:val="18"/>
               </w:rPr>
-              <w:t>Workflow: Specialist Referral Letter and Documentation Preparation</w:t>
+              <w:t>Workflow: Specialty Consultation Note</w:t>
+            </w:r>
+          </w:p>
+          <w:p>
+            <w:r>
+              <w:rPr>
+                <w:sz w:val="18"/>
+              </w:rPr>
+              <w:t>Priority: P1</w:t>
             </w:r>
           </w:p>
           <w:p>
@@ -923,6 +971,14 @@
               <w:rPr>
                 <w:sz w:val="18"/>
               </w:rPr>
+              <w:t>Priority: P0</w:t>
+            </w:r>
+          </w:p>
+          <w:p>
+            <w:r>
+              <w:rPr>
+                <w:sz w:val="18"/>
+              </w:rPr>
               <w:t>Structure: External position review</w:t>
             </w:r>
           </w:p>
@@ -971,7 +1027,15 @@
               <w:rPr>
                 <w:sz w:val="18"/>
               </w:rPr>
-              <w:t>Workflow: Patient Safety Event Investigation and Root Cause Analysis</w:t>
+              <w:t>Workflow: Corrective Action Plan (CAP) Development and Tracking</w:t>
+            </w:r>
+          </w:p>
+          <w:p>
+            <w:r>
+              <w:rPr>
+                <w:sz w:val="18"/>
+              </w:rPr>
+              <w:t>Priority: P1</w:t>
             </w:r>
           </w:p>
           <w:p>
@@ -1035,6 +1099,14 @@
               <w:rPr>
                 <w:sz w:val="18"/>
               </w:rPr>
+              <w:t>Priority: P0</w:t>
+            </w:r>
+          </w:p>
+          <w:p>
+            <w:r>
+              <w:rPr>
+                <w:sz w:val="18"/>
+              </w:rPr>
               <w:t>Structure: Extraction to schema</w:t>
             </w:r>
           </w:p>
@@ -1091,6 +1163,14 @@
               <w:rPr>
                 <w:sz w:val="18"/>
               </w:rPr>
+              <w:t>Priority: P0</w:t>
+            </w:r>
+          </w:p>
+          <w:p>
+            <w:r>
+              <w:rPr>
+                <w:sz w:val="18"/>
+              </w:rPr>
               <w:t>Structure: Query response</w:t>
             </w:r>
           </w:p>
@@ -1130,7 +1210,7 @@
               <w:rPr>
                 <w:sz w:val="18"/>
               </w:rPr>
-              <w:t>Structure spread: external position review x2, forced inventory, determination, completion x1, coordination synthesis, specialist handoff, investigation, extraction to schema, and query response. The shared chart stays raw, with no single summary that states the final readiness conclusion. Later administrative, quality, referral, and safety tasks branch independently from the same approved world snapshot and their own requester materials; they are not sequential outputs of earlier tasks.</w:t>
+              <w:t>Structure spread: external position review x2, forced inventory, determination, completion x1, coordination synthesis, specialist handoff, investigation, extraction to schema, and query response. The shared chart stays raw, with no single summary that states the final readiness conclusion. Later administrative, quality, referral, and safety tasks branch independently from the same approved world snapshot and their own requester materials; they are not sequential outputs of earlier tasks. Priority spread: seven P0 and three P1 (Tasks 4, 6, 8), with at least one P0 present as required.</w:t>
             </w:r>
           </w:p>
         </w:tc>

</xml_diff>

<commit_message>
Apply ratified comorbidity+med expansion to Marva brainstorm: HFpEF, 15 named comorbidities (12 core + 3 declared-noise), ~17 named baseline agents + home O2/CPAP; ARB replaces ACE in cards-vs-neph friction; bone axis kept silent (cholecalciferol only), no ESA; docx rebuilt (gates green, no leaks/dashes); mark KM-repeat audit items resolved
</commit_message>
<xml_diff>
--- a/worlds/marva-lydell/submission/Marva_Lydell_Brainstorm.docx
+++ b/worlds/marva-lydell/submission/Marva_Lydell_Brainstorm.docx
@@ -190,7 +190,7 @@
               <w:rPr>
                 <w:sz w:val="18"/>
               </w:rPr>
-              <w:t>This is an inpatient hospital medicine world: a 7-day admission for acute decompensated heart failure with hypoxemia and cardiorenal acute kidney injury in Marva Lydell, a 72-year-old Black woman with chronic heart failure, atrial fibrillation on anticoagulation, CKD stage 3b to 4, COPD and obstructive sleep apnea overlap, type 2 diabetes, hypertension, obesity, and limited mobility. She presents with dyspnea, edema, rising weight, exertional intolerance, and worsening kidney function after several days of worsening symptoms at home. The course runs ED evaluation, admission for IV diuresis and oxygen assessment, cardiology and nephrology consultation, respiratory therapy testing, therapy evaluation, medication adjustment, and discharge planning.</w:t>
+              <w:t>This is an inpatient hospital medicine world: a 7-day admission for acute decompensated heart failure with hypoxemia and cardiorenal acute kidney injury in Marva Lydell, a 72-year-old Black woman with heart failure with preserved ejection fraction, atrial fibrillation on anticoagulation, coronary artery disease with prior percutaneous coronary intervention, CKD stage 3b to 4, COPD, obstructive sleep apnea, type 2 diabetes with peripheral neuropathy, hypertension, obesity, anemia of chronic kidney disease, vitamin D deficiency, hypothyroidism, gastroesophageal reflux, and chronic constipation, with limited mobility at baseline. She presents with dyspnea, edema, rising weight, exertional intolerance, and worsening kidney function after several days of worsening symptoms at home. The course runs ED evaluation, admission for IV diuresis and oxygen assessment, cardiology and nephrology consultation, respiratory therapy testing, therapy evaluation, medication adjustment, and discharge planning. Baseline medications include empagliflozin, spironolactone, torsemide, metoprolol succinate, losartan, apixaban, aspirin, metformin, insulin glargine, atorvastatin, cholecalciferol, ferrous sulfate, tiotropium with albuterol, gabapentin, levothyroxine, pantoprazole, and senna, with home oxygen and CPAP.</w:t>
             </w:r>
           </w:p>
           <w:p>
@@ -293,7 +293,7 @@
               <w:rPr>
                 <w:sz w:val="18"/>
               </w:rPr>
-              <w:t>- Cardiology versus nephrology: cardiology prioritizes decongestion, heart-failure protection, and readmission prevention; nephrology prioritizes kidney recovery, potassium safety, and careful timing for ACE inhibitor, SGLT2 inhibitor, metformin, and diuretic changes.</w:t>
+              <w:t>- Cardiology versus nephrology: cardiology prioritizes decongestion, heart-failure protection, and readmission prevention; nephrology prioritizes kidney recovery, potassium safety, and careful timing for renin-angiotensin blocker, SGLT2 inhibitor, metformin, and diuretic changes.</w:t>
             </w:r>
           </w:p>
           <w:p>
@@ -715,6 +715,70 @@
               <w:rPr>
                 <w:sz w:val="18"/>
               </w:rPr>
+              <w:t>Priority: P1</w:t>
+            </w:r>
+          </w:p>
+          <w:p>
+            <w:r>
+              <w:rPr>
+                <w:sz w:val="18"/>
+              </w:rPr>
+              <w:t>Structure: Determination</w:t>
+            </w:r>
+          </w:p>
+          <w:p>
+            <w:r>
+              <w:rPr>
+                <w:sz w:val="18"/>
+              </w:rPr>
+              <w:t>Required decision: Approve continued stay, narrow, or deny</w:t>
+            </w:r>
+          </w:p>
+          <w:p>
+            <w:r>
+              <w:rPr>
+                <w:sz w:val="18"/>
+              </w:rPr>
+              <w:t>Clinical trap: Review worksheet treats improvement after diuresis as readiness despite unresolved oxygen equipment and exertional tolerance</w:t>
+            </w:r>
+          </w:p>
+          <w:p>
+            <w:r>
+              <w:rPr>
+                <w:sz w:val="18"/>
+              </w:rPr>
+              <w:t>Anchor: July 11, 2025 at 14:00</w:t>
+            </w:r>
+          </w:p>
+          <w:p>
+            <w:r>
+              <w:rPr>
+                <w:sz w:val="18"/>
+              </w:rPr>
+              <w:t>4. Transition note completion</w:t>
+            </w:r>
+          </w:p>
+          <w:p>
+            <w:r>
+              <w:rPr>
+                <w:sz w:val="18"/>
+              </w:rPr>
+              <w:t>Requester: Discharging attending</w:t>
+            </w:r>
+          </w:p>
+          <w:p>
+            <w:r>
+              <w:rPr>
+                <w:sz w:val="18"/>
+              </w:rPr>
+              <w:t>Workflow: Medical Transcription and Clinical Documentation Completion</w:t>
+            </w:r>
+          </w:p>
+          <w:p>
+            <w:r>
+              <w:rPr>
+                <w:sz w:val="18"/>
+              </w:rPr>
               <w:t>Priority: P0</w:t>
             </w:r>
           </w:p>
@@ -723,55 +787,119 @@
               <w:rPr>
                 <w:sz w:val="18"/>
               </w:rPr>
-              <w:t>Structure: Determination</w:t>
-            </w:r>
-          </w:p>
-          <w:p>
-            <w:r>
-              <w:rPr>
-                <w:sz w:val="18"/>
-              </w:rPr>
-              <w:t>Required decision: Approve continued stay, narrow, or deny</w:t>
-            </w:r>
-          </w:p>
-          <w:p>
-            <w:r>
-              <w:rPr>
-                <w:sz w:val="18"/>
-              </w:rPr>
-              <w:t>Clinical trap: Review worksheet treats improvement after diuresis as readiness despite unresolved oxygen equipment and exertional tolerance</w:t>
-            </w:r>
-          </w:p>
-          <w:p>
-            <w:r>
-              <w:rPr>
-                <w:sz w:val="18"/>
-              </w:rPr>
-              <w:t>Anchor: July 11, 2025 at 14:00</w:t>
-            </w:r>
-          </w:p>
-          <w:p>
-            <w:r>
-              <w:rPr>
-                <w:sz w:val="18"/>
-              </w:rPr>
-              <w:t>4. Transition note completion</w:t>
-            </w:r>
-          </w:p>
-          <w:p>
-            <w:r>
-              <w:rPr>
-                <w:sz w:val="18"/>
-              </w:rPr>
-              <w:t>Requester: Discharging attending</w:t>
-            </w:r>
-          </w:p>
-          <w:p>
-            <w:r>
-              <w:rPr>
-                <w:sz w:val="18"/>
-              </w:rPr>
-              <w:t>Workflow: Medical Transcription and Clinical Documentation Completion</w:t>
+              <w:t>Structure: Completion, the single completion task</w:t>
+            </w:r>
+          </w:p>
+          <w:p>
+            <w:r>
+              <w:rPr>
+                <w:sz w:val="18"/>
+              </w:rPr>
+              <w:t>Required decision: Finish open sections without falsely closing readiness</w:t>
+            </w:r>
+          </w:p>
+          <w:p>
+            <w:r>
+              <w:rPr>
+                <w:sz w:val="18"/>
+              </w:rPr>
+              <w:t>Clinical trap: Started note leaves oxygen, volume, and follow-up ownership open against a reassuring draft tone</w:t>
+            </w:r>
+          </w:p>
+          <w:p>
+            <w:r>
+              <w:rPr>
+                <w:sz w:val="18"/>
+              </w:rPr>
+              <w:t>Anchor: July 12, 2025 at 08:30</w:t>
+            </w:r>
+          </w:p>
+          <w:p>
+            <w:r>
+              <w:rPr>
+                <w:sz w:val="18"/>
+              </w:rPr>
+              <w:t>5. Post-acute coordination plan</w:t>
+            </w:r>
+          </w:p>
+          <w:p>
+            <w:r>
+              <w:rPr>
+                <w:sz w:val="18"/>
+              </w:rPr>
+              <w:t>Requester: Case manager</w:t>
+            </w:r>
+          </w:p>
+          <w:p>
+            <w:r>
+              <w:rPr>
+                <w:sz w:val="18"/>
+              </w:rPr>
+              <w:t>Workflow: Post-Acute Care Coordination Documentation</w:t>
+            </w:r>
+          </w:p>
+          <w:p>
+            <w:r>
+              <w:rPr>
+                <w:sz w:val="18"/>
+              </w:rPr>
+              <w:t>Priority: P0</w:t>
+            </w:r>
+          </w:p>
+          <w:p>
+            <w:r>
+              <w:rPr>
+                <w:sz w:val="18"/>
+              </w:rPr>
+              <w:t>Structure: Coordination synthesis</w:t>
+            </w:r>
+          </w:p>
+          <w:p>
+            <w:r>
+              <w:rPr>
+                <w:sz w:val="18"/>
+              </w:rPr>
+              <w:t>Required decision: Assign owner, status, and next action for each transition item</w:t>
+            </w:r>
+          </w:p>
+          <w:p>
+            <w:r>
+              <w:rPr>
+                <w:sz w:val="18"/>
+              </w:rPr>
+              <w:t>Clinical trap: Case-management prose says DME arranged while vendor status leaves portable oxygen unresolved</w:t>
+            </w:r>
+          </w:p>
+          <w:p>
+            <w:r>
+              <w:rPr>
+                <w:sz w:val="18"/>
+              </w:rPr>
+              <w:t>Anchor: July 12, 2025 at 13:00</w:t>
+            </w:r>
+          </w:p>
+          <w:p>
+            <w:r>
+              <w:rPr>
+                <w:sz w:val="18"/>
+              </w:rPr>
+              <w:t>6. Cardiorenal follow-up letter</w:t>
+            </w:r>
+          </w:p>
+          <w:p>
+            <w:r>
+              <w:rPr>
+                <w:sz w:val="18"/>
+              </w:rPr>
+              <w:t>Requester: Hospitalist attending</w:t>
+            </w:r>
+          </w:p>
+          <w:p>
+            <w:r>
+              <w:rPr>
+                <w:sz w:val="18"/>
+              </w:rPr>
+              <w:t>Workflow: Specialty Consultation Note</w:t>
             </w:r>
           </w:p>
           <w:p>
@@ -787,55 +915,55 @@
               <w:rPr>
                 <w:sz w:val="18"/>
               </w:rPr>
-              <w:t>Structure: Completion, the single completion task</w:t>
-            </w:r>
-          </w:p>
-          <w:p>
-            <w:r>
-              <w:rPr>
-                <w:sz w:val="18"/>
-              </w:rPr>
-              <w:t>Required decision: Finish open sections without falsely closing readiness</w:t>
-            </w:r>
-          </w:p>
-          <w:p>
-            <w:r>
-              <w:rPr>
-                <w:sz w:val="18"/>
-              </w:rPr>
-              <w:t>Clinical trap: Started note leaves oxygen, volume, and follow-up ownership open against a reassuring draft tone</w:t>
-            </w:r>
-          </w:p>
-          <w:p>
-            <w:r>
-              <w:rPr>
-                <w:sz w:val="18"/>
-              </w:rPr>
-              <w:t>Anchor: July 12, 2025 at 08:30</w:t>
-            </w:r>
-          </w:p>
-          <w:p>
-            <w:r>
-              <w:rPr>
-                <w:sz w:val="18"/>
-              </w:rPr>
-              <w:t>5. Post-acute coordination plan</w:t>
-            </w:r>
-          </w:p>
-          <w:p>
-            <w:r>
-              <w:rPr>
-                <w:sz w:val="18"/>
-              </w:rPr>
-              <w:t>Requester: Case manager</w:t>
-            </w:r>
-          </w:p>
-          <w:p>
-            <w:r>
-              <w:rPr>
-                <w:sz w:val="18"/>
-              </w:rPr>
-              <w:t>Workflow: Post-Acute Care Coordination Documentation</w:t>
+              <w:t>Structure: Specialist handoff</w:t>
+            </w:r>
+          </w:p>
+          <w:p>
+            <w:r>
+              <w:rPr>
+                <w:sz w:val="18"/>
+              </w:rPr>
+              <w:t>Required decision: Route diuretic, renal labs, potassium, anticoagulation, and restart decisions to the correct owner</w:t>
+            </w:r>
+          </w:p>
+          <w:p>
+            <w:r>
+              <w:rPr>
+                <w:sz w:val="18"/>
+              </w:rPr>
+              <w:t>Clinical trap: Follow-up draft makes the plan sound settled while renal and volume decisions remain conditional</w:t>
+            </w:r>
+          </w:p>
+          <w:p>
+            <w:r>
+              <w:rPr>
+                <w:sz w:val="18"/>
+              </w:rPr>
+              <w:t>Anchor: July 13, 2025 at 11:00</w:t>
+            </w:r>
+          </w:p>
+          <w:p>
+            <w:r>
+              <w:rPr>
+                <w:sz w:val="18"/>
+              </w:rPr>
+              <w:t>7. Home health versus SNF appeal</w:t>
+            </w:r>
+          </w:p>
+          <w:p>
+            <w:r>
+              <w:rPr>
+                <w:sz w:val="18"/>
+              </w:rPr>
+              <w:t>Requester: Hospitalist attending for utilization management</w:t>
+            </w:r>
+          </w:p>
+          <w:p>
+            <w:r>
+              <w:rPr>
+                <w:sz w:val="18"/>
+              </w:rPr>
+              <w:t>Workflow: Claims Denial Analysis and Appeal Preparation</w:t>
             </w:r>
           </w:p>
           <w:p>
@@ -851,55 +979,55 @@
               <w:rPr>
                 <w:sz w:val="18"/>
               </w:rPr>
-              <w:t>Structure: Coordination synthesis</w:t>
-            </w:r>
-          </w:p>
-          <w:p>
-            <w:r>
-              <w:rPr>
-                <w:sz w:val="18"/>
-              </w:rPr>
-              <w:t>Required decision: Assign owner, status, and next action for each transition item</w:t>
-            </w:r>
-          </w:p>
-          <w:p>
-            <w:r>
-              <w:rPr>
-                <w:sz w:val="18"/>
-              </w:rPr>
-              <w:t>Clinical trap: Case-management prose says DME arranged while vendor status leaves portable oxygen unresolved</w:t>
-            </w:r>
-          </w:p>
-          <w:p>
-            <w:r>
-              <w:rPr>
-                <w:sz w:val="18"/>
-              </w:rPr>
-              <w:t>Anchor: July 12, 2025 at 13:00</w:t>
-            </w:r>
-          </w:p>
-          <w:p>
-            <w:r>
-              <w:rPr>
-                <w:sz w:val="18"/>
-              </w:rPr>
-              <w:t>6. Cardiorenal follow-up letter</w:t>
-            </w:r>
-          </w:p>
-          <w:p>
-            <w:r>
-              <w:rPr>
-                <w:sz w:val="18"/>
-              </w:rPr>
-              <w:t>Requester: Hospitalist attending</w:t>
-            </w:r>
-          </w:p>
-          <w:p>
-            <w:r>
-              <w:rPr>
-                <w:sz w:val="18"/>
-              </w:rPr>
-              <w:t>Workflow: Specialty Consultation Note</w:t>
+              <w:t>Structure: External position review</w:t>
+            </w:r>
+          </w:p>
+          <w:p>
+            <w:r>
+              <w:rPr>
+                <w:sz w:val="18"/>
+              </w:rPr>
+              <w:t>Required decision: Support skilled need or accept home-health pathway</w:t>
+            </w:r>
+          </w:p>
+          <w:p>
+            <w:r>
+              <w:rPr>
+                <w:sz w:val="18"/>
+              </w:rPr>
+              <w:t>Clinical trap: Denial treats home health as sufficient despite stairs, oxygen burden, functional limits, and medication complexity</w:t>
+            </w:r>
+          </w:p>
+          <w:p>
+            <w:r>
+              <w:rPr>
+                <w:sz w:val="18"/>
+              </w:rPr>
+              <w:t>Anchor: July 15, 2025 at 10:00</w:t>
+            </w:r>
+          </w:p>
+          <w:p>
+            <w:r>
+              <w:rPr>
+                <w:sz w:val="18"/>
+              </w:rPr>
+              <w:t>8. Safety review after bounceback</w:t>
+            </w:r>
+          </w:p>
+          <w:p>
+            <w:r>
+              <w:rPr>
+                <w:sz w:val="18"/>
+              </w:rPr>
+              <w:t>Requester: Patient safety officer</w:t>
+            </w:r>
+          </w:p>
+          <w:p>
+            <w:r>
+              <w:rPr>
+                <w:sz w:val="18"/>
+              </w:rPr>
+              <w:t>Workflow: Corrective Action Plan (CAP) Development and Tracking</w:t>
             </w:r>
           </w:p>
           <w:p>
@@ -915,55 +1043,55 @@
               <w:rPr>
                 <w:sz w:val="18"/>
               </w:rPr>
-              <w:t>Structure: Specialist handoff</w:t>
-            </w:r>
-          </w:p>
-          <w:p>
-            <w:r>
-              <w:rPr>
-                <w:sz w:val="18"/>
-              </w:rPr>
-              <w:t>Required decision: Route diuretic, renal labs, potassium, anticoagulation, and restart decisions to the correct owner</w:t>
-            </w:r>
-          </w:p>
-          <w:p>
-            <w:r>
-              <w:rPr>
-                <w:sz w:val="18"/>
-              </w:rPr>
-              <w:t>Clinical trap: Follow-up draft makes the plan sound settled while renal and volume decisions remain conditional</w:t>
-            </w:r>
-          </w:p>
-          <w:p>
-            <w:r>
-              <w:rPr>
-                <w:sz w:val="18"/>
-              </w:rPr>
-              <w:t>Anchor: July 13, 2025 at 11:00</w:t>
-            </w:r>
-          </w:p>
-          <w:p>
-            <w:r>
-              <w:rPr>
-                <w:sz w:val="18"/>
-              </w:rPr>
-              <w:t>7. Home health versus SNF appeal</w:t>
-            </w:r>
-          </w:p>
-          <w:p>
-            <w:r>
-              <w:rPr>
-                <w:sz w:val="18"/>
-              </w:rPr>
-              <w:t>Requester: Hospitalist attending for utilization management</w:t>
-            </w:r>
-          </w:p>
-          <w:p>
-            <w:r>
-              <w:rPr>
-                <w:sz w:val="18"/>
-              </w:rPr>
-              <w:t>Workflow: Claims Denial Analysis and Appeal Preparation</w:t>
+              <w:t>Structure: Investigation</w:t>
+            </w:r>
+          </w:p>
+          <w:p>
+            <w:r>
+              <w:rPr>
+                <w:sz w:val="18"/>
+              </w:rPr>
+              <w:t>Required decision: Identify likely cause and prevention steps</w:t>
+            </w:r>
+          </w:p>
+          <w:p>
+            <w:r>
+              <w:rPr>
+                <w:sz w:val="18"/>
+              </w:rPr>
+              <w:t>Clinical trap: Initial event note blames nonadherence while the record supports equipment or handoff failure</w:t>
+            </w:r>
+          </w:p>
+          <w:p>
+            <w:r>
+              <w:rPr>
+                <w:sz w:val="18"/>
+              </w:rPr>
+              <w:t>Anchor: July 16, 2025 at 09:00</w:t>
+            </w:r>
+          </w:p>
+          <w:p>
+            <w:r>
+              <w:rPr>
+                <w:sz w:val="18"/>
+              </w:rPr>
+              <w:t>9. Heart-failure transition quality abstraction</w:t>
+            </w:r>
+          </w:p>
+          <w:p>
+            <w:r>
+              <w:rPr>
+                <w:sz w:val="18"/>
+              </w:rPr>
+              <w:t>Requester: Quality abstraction nurse</w:t>
+            </w:r>
+          </w:p>
+          <w:p>
+            <w:r>
+              <w:rPr>
+                <w:sz w:val="18"/>
+              </w:rPr>
+              <w:t>Workflow: HEDIS Medical Record Chart Abstraction and Review</w:t>
             </w:r>
           </w:p>
           <w:p>
@@ -979,55 +1107,55 @@
               <w:rPr>
                 <w:sz w:val="18"/>
               </w:rPr>
-              <w:t>Structure: External position review</w:t>
-            </w:r>
-          </w:p>
-          <w:p>
-            <w:r>
-              <w:rPr>
-                <w:sz w:val="18"/>
-              </w:rPr>
-              <w:t>Required decision: Support skilled need or accept home-health pathway</w:t>
-            </w:r>
-          </w:p>
-          <w:p>
-            <w:r>
-              <w:rPr>
-                <w:sz w:val="18"/>
-              </w:rPr>
-              <w:t>Clinical trap: Denial treats home health as sufficient despite stairs, oxygen burden, functional limits, and medication complexity</w:t>
-            </w:r>
-          </w:p>
-          <w:p>
-            <w:r>
-              <w:rPr>
-                <w:sz w:val="18"/>
-              </w:rPr>
-              <w:t>Anchor: July 15, 2025 at 10:00</w:t>
-            </w:r>
-          </w:p>
-          <w:p>
-            <w:r>
-              <w:rPr>
-                <w:sz w:val="18"/>
-              </w:rPr>
-              <w:t>8. Safety review after bounceback</w:t>
-            </w:r>
-          </w:p>
-          <w:p>
-            <w:r>
-              <w:rPr>
-                <w:sz w:val="18"/>
-              </w:rPr>
-              <w:t>Requester: Patient safety officer</w:t>
-            </w:r>
-          </w:p>
-          <w:p>
-            <w:r>
-              <w:rPr>
-                <w:sz w:val="18"/>
-              </w:rPr>
-              <w:t>Workflow: Corrective Action Plan (CAP) Development and Tracking</w:t>
+              <w:t>Structure: Extraction to schema</w:t>
+            </w:r>
+          </w:p>
+          <w:p>
+            <w:r>
+              <w:rPr>
+                <w:sz w:val="18"/>
+              </w:rPr>
+              <w:t>Required decision: Record documented value, exclusion, or unable-to-determine per field</w:t>
+            </w:r>
+          </w:p>
+          <w:p>
+            <w:r>
+              <w:rPr>
+                <w:sz w:val="18"/>
+              </w:rPr>
+              <w:t>Clinical trap: Abstractor worksheet rewards a clean transition although oxygen or follow-up evidence is incomplete</w:t>
+            </w:r>
+          </w:p>
+          <w:p>
+            <w:r>
+              <w:rPr>
+                <w:sz w:val="18"/>
+              </w:rPr>
+              <w:t>Anchor: July 17, 2025 at 09:00</w:t>
+            </w:r>
+          </w:p>
+          <w:p>
+            <w:r>
+              <w:rPr>
+                <w:sz w:val="18"/>
+              </w:rPr>
+              <w:t>10. Documentation query response</w:t>
+            </w:r>
+          </w:p>
+          <w:p>
+            <w:r>
+              <w:rPr>
+                <w:sz w:val="18"/>
+              </w:rPr>
+              <w:t>Requester: CDI specialist</w:t>
+            </w:r>
+          </w:p>
+          <w:p>
+            <w:r>
+              <w:rPr>
+                <w:sz w:val="18"/>
+              </w:rPr>
+              <w:t>Workflow: Clinical Documentation Improvement (CDI) Query Response Review</w:t>
             </w:r>
           </w:p>
           <w:p>
@@ -1043,134 +1171,6 @@
               <w:rPr>
                 <w:sz w:val="18"/>
               </w:rPr>
-              <w:t>Structure: Investigation</w:t>
-            </w:r>
-          </w:p>
-          <w:p>
-            <w:r>
-              <w:rPr>
-                <w:sz w:val="18"/>
-              </w:rPr>
-              <w:t>Required decision: Identify likely cause and prevention steps</w:t>
-            </w:r>
-          </w:p>
-          <w:p>
-            <w:r>
-              <w:rPr>
-                <w:sz w:val="18"/>
-              </w:rPr>
-              <w:t>Clinical trap: Initial event note blames nonadherence while the record supports equipment or handoff failure</w:t>
-            </w:r>
-          </w:p>
-          <w:p>
-            <w:r>
-              <w:rPr>
-                <w:sz w:val="18"/>
-              </w:rPr>
-              <w:t>Anchor: July 16, 2025 at 09:00</w:t>
-            </w:r>
-          </w:p>
-          <w:p>
-            <w:r>
-              <w:rPr>
-                <w:sz w:val="18"/>
-              </w:rPr>
-              <w:t>9. Heart-failure transition quality abstraction</w:t>
-            </w:r>
-          </w:p>
-          <w:p>
-            <w:r>
-              <w:rPr>
-                <w:sz w:val="18"/>
-              </w:rPr>
-              <w:t>Requester: Quality abstraction nurse</w:t>
-            </w:r>
-          </w:p>
-          <w:p>
-            <w:r>
-              <w:rPr>
-                <w:sz w:val="18"/>
-              </w:rPr>
-              <w:t>Workflow: HEDIS Medical Record Chart Abstraction and Review</w:t>
-            </w:r>
-          </w:p>
-          <w:p>
-            <w:r>
-              <w:rPr>
-                <w:sz w:val="18"/>
-              </w:rPr>
-              <w:t>Priority: P0</w:t>
-            </w:r>
-          </w:p>
-          <w:p>
-            <w:r>
-              <w:rPr>
-                <w:sz w:val="18"/>
-              </w:rPr>
-              <w:t>Structure: Extraction to schema</w:t>
-            </w:r>
-          </w:p>
-          <w:p>
-            <w:r>
-              <w:rPr>
-                <w:sz w:val="18"/>
-              </w:rPr>
-              <w:t>Required decision: Record documented value, exclusion, or unable-to-determine per field</w:t>
-            </w:r>
-          </w:p>
-          <w:p>
-            <w:r>
-              <w:rPr>
-                <w:sz w:val="18"/>
-              </w:rPr>
-              <w:t>Clinical trap: Abstractor worksheet rewards a clean transition although oxygen or follow-up evidence is incomplete</w:t>
-            </w:r>
-          </w:p>
-          <w:p>
-            <w:r>
-              <w:rPr>
-                <w:sz w:val="18"/>
-              </w:rPr>
-              <w:t>Anchor: July 17, 2025 at 09:00</w:t>
-            </w:r>
-          </w:p>
-          <w:p>
-            <w:r>
-              <w:rPr>
-                <w:sz w:val="18"/>
-              </w:rPr>
-              <w:t>10. Documentation query response</w:t>
-            </w:r>
-          </w:p>
-          <w:p>
-            <w:r>
-              <w:rPr>
-                <w:sz w:val="18"/>
-              </w:rPr>
-              <w:t>Requester: CDI specialist</w:t>
-            </w:r>
-          </w:p>
-          <w:p>
-            <w:r>
-              <w:rPr>
-                <w:sz w:val="18"/>
-              </w:rPr>
-              <w:t>Workflow: Clinical Documentation Improvement (CDI) Query Response Review</w:t>
-            </w:r>
-          </w:p>
-          <w:p>
-            <w:r>
-              <w:rPr>
-                <w:sz w:val="18"/>
-              </w:rPr>
-              <w:t>Priority: P0</w:t>
-            </w:r>
-          </w:p>
-          <w:p>
-            <w:r>
-              <w:rPr>
-                <w:sz w:val="18"/>
-              </w:rPr>
               <w:t>Structure: Query response</w:t>
             </w:r>
           </w:p>
@@ -1210,7 +1210,7 @@
               <w:rPr>
                 <w:sz w:val="18"/>
               </w:rPr>
-              <w:t>Structure spread: external position review x2, forced inventory, determination, completion x1, coordination synthesis, specialist handoff, investigation, extraction to schema, and query response. The shared chart stays raw, with no single summary that states the final readiness conclusion. Later administrative, quality, referral, and safety tasks branch independently from the same approved world snapshot and their own requester materials; they are not sequential outputs of earlier tasks. Priority spread: seven P0 and three P1 (Tasks 4, 6, 8), with at least one P0 present as required.</w:t>
+              <w:t>Structure spread: external position review x2, forced inventory, determination, completion x1, coordination synthesis, specialist handoff, investigation, extraction to schema, and query response. The shared chart stays raw, with no single summary that states the final readiness conclusion. Later administrative, quality, referral, and safety tasks branch independently from the same approved world snapshot and their own requester materials; they are not sequential outputs of earlier tasks. Priority spread: six P0 (Tasks 1, 2, 4, 5, 7, 9) and four P1 (Tasks 3, 6, 8, 10), with at least one P0 present as required.</w:t>
             </w:r>
           </w:p>
         </w:tc>

</xml_diff>